<commit_message>
Clean up evaluation report: fix percentages, remove Jan/Feb framing, use uro-oncologist
- Fix *100 bug in compute_full_pipeline (was showing 6522% instead of 65.2%)
- Remove Section 8 (Performance Across Evaluation Rounds) with unreliable data
- Remove Score Correlations section, Inference Infrastructure table, Scalability section
- Remove all Jan/Feb comparison framing and compute_run_comparison dead code
- Replace "doctor" with "uro-oncologist" throughout report and charts
- Remove "blinded" references, simplify "Next.js" to "web application"
- Simplify Multi-Schema section to brief JSON data format mention
- Add 1 decimal precision to all percentage values in tables and text
- Renumber sections consecutively (1-20)
- Clean up stale chart files (run_comparison.png, scatter_correlations.png)
</commit_message>
<xml_diff>
--- a/findings/evaluation_report_2026-02-18.docx
+++ b/findings/evaluation_report_2026-02-18.docx
@@ -30,7 +30,7 @@
           <w:color w:val="64748B"/>
           <w:sz w:val="32"/>
         </w:rPr>
-        <w:t>Doctor vs AI Judges in Medical Oncology</w:t>
+        <w:t>Uro-Oncologist vs AI Judges in Medical Oncology</w:t>
         <w:br/>
         <w:t>Therapy Recommendation Assessment</w:t>
       </w:r>
@@ -77,7 +77,7 @@
           <w:sz w:val="22"/>
         </w:rPr>
         <w:br/>
-        <w:t>Reviewer: Dr. Radu Alexa, Board-Certified Oncologist</w:t>
+        <w:t>Reviewer: Dr. Radu Alexa, Board-Certified Uro-Oncologist</w:t>
       </w:r>
     </w:p>
     <w:p>
@@ -99,11 +99,6 @@
       </w:r>
     </w:p>
     <w:p>
-      <w:r>
-        <w:t>Through iterative pipeline refinement between January and February 2026, the average clinically acceptable therapy rate improved from 25% to 100% (+75 pp), and exact match rate from 21% to 0% (+-21 pp).</w:t>
-      </w:r>
-    </w:p>
-    <w:p>
       <w:pPr>
         <w:pStyle w:val="Heading2"/>
       </w:pPr>
@@ -120,7 +115,7 @@
           <w:rFonts w:ascii="Arial" w:hAnsi="Arial"/>
           <w:sz w:val="20"/>
         </w:rPr>
-        <w:t>Across all 414 predictions: 64% metastatic detection accuracy, 31% exact therapy match, 59% clinically acceptable therapies.</w:t>
+        <w:t>Across all 414 predictions: 63.5% metastatic detection accuracy, 30.9% exact therapy match, 58.7% clinically acceptable therapies.</w:t>
       </w:r>
     </w:p>
     <w:p>
@@ -132,7 +127,7 @@
           <w:rFonts w:ascii="Arial" w:hAnsi="Arial"/>
           <w:sz w:val="20"/>
         </w:rPr>
-        <w:t>Best model by doctor review: MedGemma 27B (6.1/9 quality, 75% acceptable).</w:t>
+        <w:t>Best model by uro-oncologist review: MedGemma 27B (6.1/9 quality, 75.4% acceptable).</w:t>
       </w:r>
     </w:p>
     <w:p>
@@ -156,7 +151,7 @@
           <w:rFonts w:ascii="Arial" w:hAnsi="Arial"/>
           <w:sz w:val="20"/>
         </w:rPr>
-        <w:t>GPT-5.2 shows substantial agreement with the doctor (Cohen's κ = 0.629).</w:t>
+        <w:t>GPT-5.2 shows substantial agreement with the uro-oncologist (Cohen's κ = 0.629).</w:t>
       </w:r>
     </w:p>
     <w:p>
@@ -168,7 +163,7 @@
           <w:rFonts w:ascii="Arial" w:hAnsi="Arial"/>
           <w:sz w:val="20"/>
         </w:rPr>
-        <w:t>MedGemma 27B shows substantial agreement with the doctor (Cohen's κ = 0.675).</w:t>
+        <w:t>MedGemma 27B shows substantial agreement with the uro-oncologist (Cohen's κ = 0.675).</w:t>
       </w:r>
     </w:p>
     <w:p>
@@ -180,7 +175,7 @@
           <w:rFonts w:ascii="Arial" w:hAnsi="Arial"/>
           <w:sz w:val="20"/>
         </w:rPr>
-        <w:t>Inter-judge agreement: κ = 0.725, 86% concordance across 414 evaluation pairs.</w:t>
+        <w:t>Inter-judge agreement: κ = 0.725, 86.5% concordance across 414 evaluation pairs.</w:t>
       </w:r>
     </w:p>
     <w:p>
@@ -601,7 +596,7 @@
           <w:rFonts w:ascii="Arial" w:hAnsi="Arial"/>
           <w:sz w:val="20"/>
         </w:rPr>
-        <w:t>Tier 3 — Doctor Validation: A board-certified oncologist blindly reviews model predictions (therapy acceptable? quality rating) and judge evaluations (agree/partial/disagree with judge verdict).</w:t>
+        <w:t>Tier 3 — Uro-Oncologist Validation: A board-certified uro-oncologist reviews model predictions (therapy acceptable? quality rating) and judge evaluations (agree/partial/disagree with judge verdict).</w:t>
       </w:r>
     </w:p>
     <w:p>
@@ -1195,7 +1190,7 @@
           <w:rFonts w:ascii="Arial" w:hAnsi="Arial"/>
           <w:sz w:val="20"/>
         </w:rPr>
-        <w:t>Tier 3 — Physician Validation: A board-certified oncologist blindly reviews both model predictions and judge evaluations, creating a ground truth for evaluating the evaluators themselves.</w:t>
+        <w:t>Tier 3 — Uro-Oncologist Validation: A board-certified uro-oncologist reviews both model predictions and judge evaluations, creating a ground truth for evaluating the evaluators themselves.</w:t>
       </w:r>
     </w:p>
     <w:p>
@@ -1203,400 +1198,12 @@
         <w:pStyle w:val="Heading2"/>
       </w:pPr>
       <w:r>
-        <w:t>Multi-Schema Data Handling</w:t>
+        <w:t>Clinical Data Format</w:t>
       </w:r>
     </w:p>
     <w:p>
       <w:r>
-        <w:t>The clinical dataset spans four distinct JSON schema variants across the 69 cases, reflecting real-world data heterogeneity in clinical systems:</w:t>
-      </w:r>
-    </w:p>
-    <w:tbl>
-      <w:tblPr>
-        <w:tblW w:type="auto" w:w="0"/>
-        <w:jc w:val="center"/>
-        <w:tblLook w:firstColumn="1" w:firstRow="1" w:lastColumn="0" w:lastRow="0" w:noHBand="0" w:noVBand="1" w:val="04A0"/>
-      </w:tblPr>
-      <w:tblGrid>
-        <w:gridCol w:w="2160"/>
-        <w:gridCol w:w="2160"/>
-        <w:gridCol w:w="2160"/>
-        <w:gridCol w:w="2160"/>
-      </w:tblGrid>
-      <w:tr>
-        <w:tc>
-          <w:tcPr>
-            <w:tcW w:type="dxa" w:w="1701"/>
-            <w:shd w:fill="1E40AF"/>
-          </w:tcPr>
-          <w:p>
-            <w:pPr>
-              <w:jc w:val="center"/>
-            </w:pPr>
-            <w:r>
-              <w:rPr>
-                <w:rFonts w:ascii="Arial" w:hAnsi="Arial"/>
-                <w:b/>
-                <w:color w:val="FFFFFF"/>
-                <w:sz w:val="18"/>
-              </w:rPr>
-              <w:t>Schema</w:t>
-            </w:r>
-          </w:p>
-        </w:tc>
-        <w:tc>
-          <w:tcPr>
-            <w:tcW w:type="dxa" w:w="1701"/>
-            <w:shd w:fill="1E40AF"/>
-          </w:tcPr>
-          <w:p>
-            <w:pPr>
-              <w:jc w:val="center"/>
-            </w:pPr>
-            <w:r>
-              <w:rPr>
-                <w:rFonts w:ascii="Arial" w:hAnsi="Arial"/>
-                <w:b/>
-                <w:color w:val="FFFFFF"/>
-                <w:sz w:val="18"/>
-              </w:rPr>
-              <w:t>Cases</w:t>
-            </w:r>
-          </w:p>
-        </w:tc>
-        <w:tc>
-          <w:tcPr>
-            <w:tcW w:type="dxa" w:w="2268"/>
-            <w:shd w:fill="1E40AF"/>
-          </w:tcPr>
-          <w:p>
-            <w:pPr>
-              <w:jc w:val="center"/>
-            </w:pPr>
-            <w:r>
-              <w:rPr>
-                <w:rFonts w:ascii="Arial" w:hAnsi="Arial"/>
-                <w:b/>
-                <w:color w:val="FFFFFF"/>
-                <w:sz w:val="18"/>
-              </w:rPr>
-              <w:t>Structure</w:t>
-            </w:r>
-          </w:p>
-        </w:tc>
-        <w:tc>
-          <w:tcPr>
-            <w:tcW w:type="dxa" w:w="2835"/>
-            <w:shd w:fill="1E40AF"/>
-          </w:tcPr>
-          <w:p>
-            <w:pPr>
-              <w:jc w:val="center"/>
-            </w:pPr>
-            <w:r>
-              <w:rPr>
-                <w:rFonts w:ascii="Arial" w:hAnsi="Arial"/>
-                <w:b/>
-                <w:color w:val="FFFFFF"/>
-                <w:sz w:val="18"/>
-              </w:rPr>
-              <w:t>Key Differences</w:t>
-            </w:r>
-          </w:p>
-        </w:tc>
-      </w:tr>
-      <w:tr>
-        <w:tc>
-          <w:tcPr>
-            <w:tcW w:type="dxa" w:w="1701"/>
-          </w:tcPr>
-          <w:p>
-            <w:pPr>
-              <w:jc w:val="center"/>
-            </w:pPr>
-            <w:r>
-              <w:rPr>
-                <w:rFonts w:ascii="Arial" w:hAnsi="Arial"/>
-                <w:sz w:val="18"/>
-              </w:rPr>
-              <w:t>v1.1 Standard</w:t>
-            </w:r>
-          </w:p>
-        </w:tc>
-        <w:tc>
-          <w:tcPr>
-            <w:tcW w:type="dxa" w:w="1701"/>
-          </w:tcPr>
-          <w:p>
-            <w:pPr>
-              <w:jc w:val="center"/>
-            </w:pPr>
-            <w:r>
-              <w:rPr>
-                <w:rFonts w:ascii="Arial" w:hAnsi="Arial"/>
-                <w:sz w:val="18"/>
-              </w:rPr>
-              <w:t>1–14, 36–61</w:t>
-            </w:r>
-          </w:p>
-        </w:tc>
-        <w:tc>
-          <w:tcPr>
-            <w:tcW w:type="dxa" w:w="2268"/>
-          </w:tcPr>
-          <w:p>
-            <w:pPr>
-              <w:jc w:val="center"/>
-            </w:pPr>
-            <w:r>
-              <w:rPr>
-                <w:rFonts w:ascii="Arial" w:hAnsi="Arial"/>
-                <w:sz w:val="18"/>
-              </w:rPr>
-              <w:t>Top-level patient, entitäten</w:t>
-            </w:r>
-          </w:p>
-        </w:tc>
-        <w:tc>
-          <w:tcPr>
-            <w:tcW w:type="dxa" w:w="2835"/>
-          </w:tcPr>
-          <w:p>
-            <w:pPr>
-              <w:jc w:val="center"/>
-            </w:pPr>
-            <w:r>
-              <w:rPr>
-                <w:rFonts w:ascii="Arial" w:hAnsi="Arial"/>
-                <w:sz w:val="18"/>
-              </w:rPr>
-              <w:t>Nested performance_status, separate cTNM/pTNM</w:t>
-            </w:r>
-          </w:p>
-        </w:tc>
-      </w:tr>
-      <w:tr>
-        <w:tc>
-          <w:tcPr>
-            <w:tcW w:type="dxa" w:w="1701"/>
-            <w:shd w:fill="F0F4FF"/>
-          </w:tcPr>
-          <w:p>
-            <w:pPr>
-              <w:jc w:val="center"/>
-            </w:pPr>
-            <w:r>
-              <w:rPr>
-                <w:rFonts w:ascii="Arial" w:hAnsi="Arial"/>
-                <w:sz w:val="18"/>
-              </w:rPr>
-              <w:t>v1.0 Template</w:t>
-            </w:r>
-          </w:p>
-        </w:tc>
-        <w:tc>
-          <w:tcPr>
-            <w:tcW w:type="dxa" w:w="1701"/>
-            <w:shd w:fill="F0F4FF"/>
-          </w:tcPr>
-          <w:p>
-            <w:pPr>
-              <w:jc w:val="center"/>
-            </w:pPr>
-            <w:r>
-              <w:rPr>
-                <w:rFonts w:ascii="Arial" w:hAnsi="Arial"/>
-                <w:sz w:val="18"/>
-              </w:rPr>
-              <w:t>15–35, 67–69</w:t>
-            </w:r>
-          </w:p>
-        </w:tc>
-        <w:tc>
-          <w:tcPr>
-            <w:tcW w:type="dxa" w:w="2268"/>
-            <w:shd w:fill="F0F4FF"/>
-          </w:tcPr>
-          <w:p>
-            <w:pPr>
-              <w:jc w:val="center"/>
-            </w:pPr>
-            <w:r>
-              <w:rPr>
-                <w:rFonts w:ascii="Arial" w:hAnsi="Arial"/>
-                <w:sz w:val="18"/>
-              </w:rPr>
-              <w:t>Wrapped in case_template</w:t>
-            </w:r>
-          </w:p>
-        </w:tc>
-        <w:tc>
-          <w:tcPr>
-            <w:tcW w:type="dxa" w:w="2835"/>
-            <w:shd w:fill="F0F4FF"/>
-          </w:tcPr>
-          <w:p>
-            <w:pPr>
-              <w:jc w:val="center"/>
-            </w:pPr>
-            <w:r>
-              <w:rPr>
-                <w:rFonts w:ascii="Arial" w:hAnsi="Arial"/>
-                <w:sz w:val="18"/>
-              </w:rPr>
-              <w:t>Flat ECOG, single TNM field, different IMDC path</w:t>
-            </w:r>
-          </w:p>
-        </w:tc>
-      </w:tr>
-      <w:tr>
-        <w:tc>
-          <w:tcPr>
-            <w:tcW w:type="dxa" w:w="1701"/>
-          </w:tcPr>
-          <w:p>
-            <w:pPr>
-              <w:jc w:val="center"/>
-            </w:pPr>
-            <w:r>
-              <w:rPr>
-                <w:rFonts w:ascii="Arial" w:hAnsi="Arial"/>
-                <w:sz w:val="18"/>
-              </w:rPr>
-              <w:t>case-de</w:t>
-            </w:r>
-          </w:p>
-        </w:tc>
-        <w:tc>
-          <w:tcPr>
-            <w:tcW w:type="dxa" w:w="1701"/>
-          </w:tcPr>
-          <w:p>
-            <w:pPr>
-              <w:jc w:val="center"/>
-            </w:pPr>
-            <w:r>
-              <w:rPr>
-                <w:rFonts w:ascii="Arial" w:hAnsi="Arial"/>
-                <w:sz w:val="18"/>
-              </w:rPr>
-              <w:t>62–63</w:t>
-            </w:r>
-          </w:p>
-        </w:tc>
-        <w:tc>
-          <w:tcPr>
-            <w:tcW w:type="dxa" w:w="2268"/>
-          </w:tcPr>
-          <w:p>
-            <w:pPr>
-              <w:jc w:val="center"/>
-            </w:pPr>
-            <w:r>
-              <w:rPr>
-                <w:rFonts w:ascii="Arial" w:hAnsi="Arial"/>
-                <w:sz w:val="18"/>
-              </w:rPr>
-              <w:t>case.patient, case.diagnose</w:t>
-            </w:r>
-          </w:p>
-        </w:tc>
-        <w:tc>
-          <w:tcPr>
-            <w:tcW w:type="dxa" w:w="2835"/>
-          </w:tcPr>
-          <w:p>
-            <w:pPr>
-              <w:jc w:val="center"/>
-            </w:pPr>
-            <w:r>
-              <w:rPr>
-                <w:rFonts w:ascii="Arial" w:hAnsi="Arial"/>
-                <w:sz w:val="18"/>
-              </w:rPr>
-              <w:t>mRCC schema with therapieplan</w:t>
-            </w:r>
-          </w:p>
-        </w:tc>
-      </w:tr>
-      <w:tr>
-        <w:tc>
-          <w:tcPr>
-            <w:tcW w:type="dxa" w:w="1701"/>
-            <w:shd w:fill="F0F4FF"/>
-          </w:tcPr>
-          <w:p>
-            <w:pPr>
-              <w:jc w:val="center"/>
-            </w:pPr>
-            <w:r>
-              <w:rPr>
-                <w:rFonts w:ascii="Arial" w:hAnsi="Arial"/>
-                <w:sz w:val="18"/>
-              </w:rPr>
-              <w:t>diagnosen</w:t>
-            </w:r>
-          </w:p>
-        </w:tc>
-        <w:tc>
-          <w:tcPr>
-            <w:tcW w:type="dxa" w:w="1701"/>
-            <w:shd w:fill="F0F4FF"/>
-          </w:tcPr>
-          <w:p>
-            <w:pPr>
-              <w:jc w:val="center"/>
-            </w:pPr>
-            <w:r>
-              <w:rPr>
-                <w:rFonts w:ascii="Arial" w:hAnsi="Arial"/>
-                <w:sz w:val="18"/>
-              </w:rPr>
-              <w:t>64–66</w:t>
-            </w:r>
-          </w:p>
-        </w:tc>
-        <w:tc>
-          <w:tcPr>
-            <w:tcW w:type="dxa" w:w="2268"/>
-            <w:shd w:fill="F0F4FF"/>
-          </w:tcPr>
-          <w:p>
-            <w:pPr>
-              <w:jc w:val="center"/>
-            </w:pPr>
-            <w:r>
-              <w:rPr>
-                <w:rFonts w:ascii="Arial" w:hAnsi="Arial"/>
-                <w:sz w:val="18"/>
-              </w:rPr>
-              <w:t>diagnosen[], tumor_history</w:t>
-            </w:r>
-          </w:p>
-        </w:tc>
-        <w:tc>
-          <w:tcPr>
-            <w:tcW w:type="dxa" w:w="2835"/>
-            <w:shd w:fill="F0F4FF"/>
-          </w:tcPr>
-          <w:p>
-            <w:pPr>
-              <w:jc w:val="center"/>
-            </w:pPr>
-            <w:r>
-              <w:rPr>
-                <w:rFonts w:ascii="Arial" w:hAnsi="Arial"/>
-                <w:sz w:val="18"/>
-              </w:rPr>
-              <w:t>Array-based diagnosis, geplantes_vorgehen</w:t>
-            </w:r>
-          </w:p>
-        </w:tc>
-      </w:tr>
-    </w:tbl>
-    <w:p>
-      <w:r>
-        <w:t>The inference pipeline includes a _detect_case_format() function that automatically identifies and normalizes each variant, extracting ECOG, TNM, histology, and therapy fields from their respective JSON paths. A critical bug affecting cases 15–35 (missing ECOG/Karnofsky due to changed schema paths) was identified and fixed between the January and February evaluation rounds.</w:t>
+        <w:t>All 69 clinical cases are stored in structured JSON format. The inference pipeline automatically detects and normalizes schema variations across cases, extracting ECOG, TNM staging, histology, and therapy fields.</w:t>
       </w:r>
     </w:p>
     <w:p>
@@ -1609,465 +1216,7 @@
     </w:p>
     <w:p>
       <w:r>
-        <w:t>A purpose-built Next.js web application enables structured physician review of AI predictions and judge evaluations. The platform supports blinded review workflows, Likert-scale and binary ratings, and exports data to Supabase for statistical analysis. This reusable tool can be adapted for other medical AI evaluation studies.</w:t>
-      </w:r>
-    </w:p>
-    <w:p>
-      <w:pPr>
-        <w:pStyle w:val="Heading2"/>
-      </w:pPr>
-      <w:r>
-        <w:t>Inference Infrastructure</w:t>
-      </w:r>
-    </w:p>
-    <w:p>
-      <w:r>
-        <w:t>Model inference runs on Modal (serverless GPU compute) using vLLM for high-throughput batched prediction on NVIDIA H100 GPUs. All 69 cases are processed in a single batch per model, with structured output enforcement via Pydantic schemas guaranteeing valid JSON. A parallel OpenRouter API pipeline provides cross-validation.</w:t>
-      </w:r>
-    </w:p>
-    <w:tbl>
-      <w:tblPr>
-        <w:tblW w:type="auto" w:w="0"/>
-        <w:jc w:val="center"/>
-        <w:tblLook w:firstColumn="1" w:firstRow="1" w:lastColumn="0" w:lastRow="0" w:noHBand="0" w:noVBand="1" w:val="04A0"/>
-      </w:tblPr>
-      <w:tblGrid>
-        <w:gridCol w:w="2880"/>
-        <w:gridCol w:w="2880"/>
-        <w:gridCol w:w="2880"/>
-      </w:tblGrid>
-      <w:tr>
-        <w:tc>
-          <w:tcPr>
-            <w:tcW w:type="dxa" w:w="1984"/>
-            <w:shd w:fill="1E40AF"/>
-          </w:tcPr>
-          <w:p>
-            <w:pPr>
-              <w:jc w:val="center"/>
-            </w:pPr>
-            <w:r>
-              <w:rPr>
-                <w:rFonts w:ascii="Arial" w:hAnsi="Arial"/>
-                <w:b/>
-                <w:color w:val="FFFFFF"/>
-                <w:sz w:val="18"/>
-              </w:rPr>
-              <w:t>Aspect</w:t>
-            </w:r>
-          </w:p>
-        </w:tc>
-        <w:tc>
-          <w:tcPr>
-            <w:tcW w:type="dxa" w:w="2835"/>
-            <w:shd w:fill="1E40AF"/>
-          </w:tcPr>
-          <w:p>
-            <w:pPr>
-              <w:jc w:val="center"/>
-            </w:pPr>
-            <w:r>
-              <w:rPr>
-                <w:rFonts w:ascii="Arial" w:hAnsi="Arial"/>
-                <w:b/>
-                <w:color w:val="FFFFFF"/>
-                <w:sz w:val="18"/>
-              </w:rPr>
-              <w:t>Modal (Primary)</w:t>
-            </w:r>
-          </w:p>
-        </w:tc>
-        <w:tc>
-          <w:tcPr>
-            <w:tcW w:type="dxa" w:w="2835"/>
-            <w:shd w:fill="1E40AF"/>
-          </w:tcPr>
-          <w:p>
-            <w:pPr>
-              <w:jc w:val="center"/>
-            </w:pPr>
-            <w:r>
-              <w:rPr>
-                <w:rFonts w:ascii="Arial" w:hAnsi="Arial"/>
-                <w:b/>
-                <w:color w:val="FFFFFF"/>
-                <w:sz w:val="18"/>
-              </w:rPr>
-              <w:t>OpenRouter (Validation)</w:t>
-            </w:r>
-          </w:p>
-        </w:tc>
-      </w:tr>
-      <w:tr>
-        <w:tc>
-          <w:tcPr>
-            <w:tcW w:type="dxa" w:w="1984"/>
-          </w:tcPr>
-          <w:p>
-            <w:pPr>
-              <w:jc w:val="center"/>
-            </w:pPr>
-            <w:r>
-              <w:rPr>
-                <w:rFonts w:ascii="Arial" w:hAnsi="Arial"/>
-                <w:sz w:val="18"/>
-              </w:rPr>
-              <w:t>Hardware</w:t>
-            </w:r>
-          </w:p>
-        </w:tc>
-        <w:tc>
-          <w:tcPr>
-            <w:tcW w:type="dxa" w:w="2835"/>
-          </w:tcPr>
-          <w:p>
-            <w:pPr>
-              <w:jc w:val="center"/>
-            </w:pPr>
-            <w:r>
-              <w:rPr>
-                <w:rFonts w:ascii="Arial" w:hAnsi="Arial"/>
-                <w:sz w:val="18"/>
-              </w:rPr>
-              <w:t>NVIDIA H100 80GB</w:t>
-            </w:r>
-          </w:p>
-        </w:tc>
-        <w:tc>
-          <w:tcPr>
-            <w:tcW w:type="dxa" w:w="2835"/>
-          </w:tcPr>
-          <w:p>
-            <w:pPr>
-              <w:jc w:val="center"/>
-            </w:pPr>
-            <w:r>
-              <w:rPr>
-                <w:rFonts w:ascii="Arial" w:hAnsi="Arial"/>
-                <w:sz w:val="18"/>
-              </w:rPr>
-              <w:t>Cloud API</w:t>
-            </w:r>
-          </w:p>
-        </w:tc>
-      </w:tr>
-      <w:tr>
-        <w:tc>
-          <w:tcPr>
-            <w:tcW w:type="dxa" w:w="1984"/>
-            <w:shd w:fill="F0F4FF"/>
-          </w:tcPr>
-          <w:p>
-            <w:pPr>
-              <w:jc w:val="center"/>
-            </w:pPr>
-            <w:r>
-              <w:rPr>
-                <w:rFonts w:ascii="Arial" w:hAnsi="Arial"/>
-                <w:sz w:val="18"/>
-              </w:rPr>
-              <w:t>Framework</w:t>
-            </w:r>
-          </w:p>
-        </w:tc>
-        <w:tc>
-          <w:tcPr>
-            <w:tcW w:type="dxa" w:w="2835"/>
-            <w:shd w:fill="F0F4FF"/>
-          </w:tcPr>
-          <w:p>
-            <w:pPr>
-              <w:jc w:val="center"/>
-            </w:pPr>
-            <w:r>
-              <w:rPr>
-                <w:rFonts w:ascii="Arial" w:hAnsi="Arial"/>
-                <w:sz w:val="18"/>
-              </w:rPr>
-              <w:t>vLLM (batched)</w:t>
-            </w:r>
-          </w:p>
-        </w:tc>
-        <w:tc>
-          <w:tcPr>
-            <w:tcW w:type="dxa" w:w="2835"/>
-            <w:shd w:fill="F0F4FF"/>
-          </w:tcPr>
-          <w:p>
-            <w:pPr>
-              <w:jc w:val="center"/>
-            </w:pPr>
-            <w:r>
-              <w:rPr>
-                <w:rFonts w:ascii="Arial" w:hAnsi="Arial"/>
-                <w:sz w:val="18"/>
-              </w:rPr>
-              <w:t>Sequential API</w:t>
-            </w:r>
-          </w:p>
-        </w:tc>
-      </w:tr>
-      <w:tr>
-        <w:tc>
-          <w:tcPr>
-            <w:tcW w:type="dxa" w:w="1984"/>
-          </w:tcPr>
-          <w:p>
-            <w:pPr>
-              <w:jc w:val="center"/>
-            </w:pPr>
-            <w:r>
-              <w:rPr>
-                <w:rFonts w:ascii="Arial" w:hAnsi="Arial"/>
-                <w:sz w:val="18"/>
-              </w:rPr>
-              <w:t>JSON Handling</w:t>
-            </w:r>
-          </w:p>
-        </w:tc>
-        <w:tc>
-          <w:tcPr>
-            <w:tcW w:type="dxa" w:w="2835"/>
-          </w:tcPr>
-          <w:p>
-            <w:pPr>
-              <w:jc w:val="center"/>
-            </w:pPr>
-            <w:r>
-              <w:rPr>
-                <w:rFonts w:ascii="Arial" w:hAnsi="Arial"/>
-                <w:sz w:val="18"/>
-              </w:rPr>
-              <w:t>vLLM structured output</w:t>
-            </w:r>
-          </w:p>
-        </w:tc>
-        <w:tc>
-          <w:tcPr>
-            <w:tcW w:type="dxa" w:w="2835"/>
-          </w:tcPr>
-          <w:p>
-            <w:pPr>
-              <w:jc w:val="center"/>
-            </w:pPr>
-            <w:r>
-              <w:rPr>
-                <w:rFonts w:ascii="Arial" w:hAnsi="Arial"/>
-                <w:sz w:val="18"/>
-              </w:rPr>
-              <w:t>Manual regex parsing</w:t>
-            </w:r>
-          </w:p>
-        </w:tc>
-      </w:tr>
-      <w:tr>
-        <w:tc>
-          <w:tcPr>
-            <w:tcW w:type="dxa" w:w="1984"/>
-            <w:shd w:fill="F0F4FF"/>
-          </w:tcPr>
-          <w:p>
-            <w:pPr>
-              <w:jc w:val="center"/>
-            </w:pPr>
-            <w:r>
-              <w:rPr>
-                <w:rFonts w:ascii="Arial" w:hAnsi="Arial"/>
-                <w:sz w:val="18"/>
-              </w:rPr>
-              <w:t>Reproducibility</w:t>
-            </w:r>
-          </w:p>
-        </w:tc>
-        <w:tc>
-          <w:tcPr>
-            <w:tcW w:type="dxa" w:w="2835"/>
-            <w:shd w:fill="F0F4FF"/>
-          </w:tcPr>
-          <w:p>
-            <w:pPr>
-              <w:jc w:val="center"/>
-            </w:pPr>
-            <w:r>
-              <w:rPr>
-                <w:rFonts w:ascii="Arial" w:hAnsi="Arial"/>
-                <w:sz w:val="18"/>
-              </w:rPr>
-              <w:t>Seed=42, deterministic</w:t>
-            </w:r>
-          </w:p>
-        </w:tc>
-        <w:tc>
-          <w:tcPr>
-            <w:tcW w:type="dxa" w:w="2835"/>
-            <w:shd w:fill="F0F4FF"/>
-          </w:tcPr>
-          <w:p>
-            <w:pPr>
-              <w:jc w:val="center"/>
-            </w:pPr>
-            <w:r>
-              <w:rPr>
-                <w:rFonts w:ascii="Arial" w:hAnsi="Arial"/>
-                <w:sz w:val="18"/>
-              </w:rPr>
-              <w:t>Non-deterministic</w:t>
-            </w:r>
-          </w:p>
-        </w:tc>
-      </w:tr>
-      <w:tr>
-        <w:tc>
-          <w:tcPr>
-            <w:tcW w:type="dxa" w:w="1984"/>
-          </w:tcPr>
-          <w:p>
-            <w:pPr>
-              <w:jc w:val="center"/>
-            </w:pPr>
-            <w:r>
-              <w:rPr>
-                <w:rFonts w:ascii="Arial" w:hAnsi="Arial"/>
-                <w:sz w:val="18"/>
-              </w:rPr>
-              <w:t>Speed (69 cases)</w:t>
-            </w:r>
-          </w:p>
-        </w:tc>
-        <w:tc>
-          <w:tcPr>
-            <w:tcW w:type="dxa" w:w="2835"/>
-          </w:tcPr>
-          <w:p>
-            <w:pPr>
-              <w:jc w:val="center"/>
-            </w:pPr>
-            <w:r>
-              <w:rPr>
-                <w:rFonts w:ascii="Arial" w:hAnsi="Arial"/>
-                <w:sz w:val="18"/>
-              </w:rPr>
-              <w:t>~3 minutes</w:t>
-            </w:r>
-          </w:p>
-        </w:tc>
-        <w:tc>
-          <w:tcPr>
-            <w:tcW w:type="dxa" w:w="2835"/>
-          </w:tcPr>
-          <w:p>
-            <w:pPr>
-              <w:jc w:val="center"/>
-            </w:pPr>
-            <w:r>
-              <w:rPr>
-                <w:rFonts w:ascii="Arial" w:hAnsi="Arial"/>
-                <w:sz w:val="18"/>
-              </w:rPr>
-              <w:t>~15 minutes</w:t>
-            </w:r>
-          </w:p>
-        </w:tc>
-      </w:tr>
-      <w:tr>
-        <w:tc>
-          <w:tcPr>
-            <w:tcW w:type="dxa" w:w="1984"/>
-            <w:shd w:fill="F0F4FF"/>
-          </w:tcPr>
-          <w:p>
-            <w:pPr>
-              <w:jc w:val="center"/>
-            </w:pPr>
-            <w:r>
-              <w:rPr>
-                <w:rFonts w:ascii="Arial" w:hAnsi="Arial"/>
-                <w:sz w:val="18"/>
-              </w:rPr>
-              <w:t>Cost per run</w:t>
-            </w:r>
-          </w:p>
-        </w:tc>
-        <w:tc>
-          <w:tcPr>
-            <w:tcW w:type="dxa" w:w="2835"/>
-            <w:shd w:fill="F0F4FF"/>
-          </w:tcPr>
-          <w:p>
-            <w:pPr>
-              <w:jc w:val="center"/>
-            </w:pPr>
-            <w:r>
-              <w:rPr>
-                <w:rFonts w:ascii="Arial" w:hAnsi="Arial"/>
-                <w:sz w:val="18"/>
-              </w:rPr>
-              <w:t>~$0.10</w:t>
-            </w:r>
-          </w:p>
-        </w:tc>
-        <w:tc>
-          <w:tcPr>
-            <w:tcW w:type="dxa" w:w="2835"/>
-            <w:shd w:fill="F0F4FF"/>
-          </w:tcPr>
-          <w:p>
-            <w:pPr>
-              <w:jc w:val="center"/>
-            </w:pPr>
-            <w:r>
-              <w:rPr>
-                <w:rFonts w:ascii="Arial" w:hAnsi="Arial"/>
-                <w:sz w:val="18"/>
-              </w:rPr>
-              <w:t>~$0.40</w:t>
-            </w:r>
-          </w:p>
-        </w:tc>
-      </w:tr>
-    </w:tbl>
-    <w:p>
-      <w:pPr>
-        <w:pStyle w:val="Heading2"/>
-      </w:pPr>
-      <w:r>
-        <w:t>Scalability &amp; Impact</w:t>
-      </w:r>
-    </w:p>
-    <w:p>
-      <w:pPr>
-        <w:pStyle w:val="ListBullet"/>
-      </w:pPr>
-      <w:r>
-        <w:rPr>
-          <w:rFonts w:ascii="Arial" w:hAnsi="Arial"/>
-          <w:sz w:val="20"/>
-        </w:rPr>
-        <w:t>Cancer type expansion: The pipeline is cancer-agnostic — the same evaluation framework applies to prostate, urothelial, testicular, and non-urological cancers already present in the dataset.</w:t>
-      </w:r>
-    </w:p>
-    <w:p>
-      <w:pPr>
-        <w:pStyle w:val="ListBullet"/>
-      </w:pPr>
-      <w:r>
-        <w:rPr>
-          <w:rFonts w:ascii="Arial" w:hAnsi="Arial"/>
-          <w:sz w:val="20"/>
-        </w:rPr>
-        <w:t>Language adaptability: The German-language evaluation demonstrates LLM capability beyond English, relevant for clinical deployment in non-English healthcare systems.</w:t>
-      </w:r>
-    </w:p>
-    <w:p>
-      <w:pPr>
-        <w:pStyle w:val="ListBullet"/>
-      </w:pPr>
-      <w:r>
-        <w:rPr>
-          <w:rFonts w:ascii="Arial" w:hAnsi="Arial"/>
-          <w:sz w:val="20"/>
-        </w:rPr>
-        <w:t>Open-source potential: The three-tier methodology, review platform, and evaluation scripts are designed for reproducibility and can serve as a reference implementation for medical AI benchmarking.</w:t>
+        <w:t>A web application enables structured physician review of AI predictions and judge evaluations. The platform supports structured review workflows, Likert-scale and binary ratings, and exports data for statistical analysis.</w:t>
       </w:r>
     </w:p>
     <w:p>
@@ -2954,12 +2103,12 @@
         <w:pStyle w:val="Heading2"/>
       </w:pPr>
       <w:r>
-        <w:t>Physician Validation Protocol</w:t>
+        <w:t>Uro-Oncologist Validation Protocol</w:t>
       </w:r>
     </w:p>
     <w:p>
       <w:r>
-        <w:t>Dr. Radu Alexa, a board-certified oncologist, independently reviews both model predictions and judge evaluations through a custom web platform. Reviews are blinded: the physician does not see model identifiers. Two distinct review types are conducted:</w:t>
+        <w:t>Dr. Radu Alexa, a board-certified uro-oncologist, independently reviews both model predictions and judge evaluations through a custom web platform. Two distinct review types are conducted:</w:t>
       </w:r>
     </w:p>
     <w:tbl>
@@ -3461,7 +2610,7 @@
                 <w:rFonts w:ascii="Arial" w:hAnsi="Arial"/>
                 <w:sz w:val="18"/>
               </w:rPr>
-              <w:t>36 (52%)</w:t>
+              <w:t>36 (52.2%)</w:t>
             </w:r>
           </w:p>
         </w:tc>
@@ -3497,7 +2646,7 @@
                 <w:rFonts w:ascii="Arial" w:hAnsi="Arial"/>
                 <w:sz w:val="18"/>
               </w:rPr>
-              <w:t>33 (48%)</w:t>
+              <w:t>33 (47.8%)</w:t>
             </w:r>
           </w:p>
         </w:tc>
@@ -3765,7 +2914,7 @@
                 <w:rFonts w:ascii="Arial" w:hAnsi="Arial"/>
                 <w:sz w:val="18"/>
               </w:rPr>
-              <w:t>19%</w:t>
+              <w:t>18.8%</w:t>
             </w:r>
           </w:p>
         </w:tc>
@@ -3838,7 +2987,7 @@
                 <w:rFonts w:ascii="Arial" w:hAnsi="Arial"/>
                 <w:sz w:val="18"/>
               </w:rPr>
-              <w:t>30%</w:t>
+              <w:t>29.7%</w:t>
             </w:r>
           </w:p>
         </w:tc>
@@ -3909,7 +3058,7 @@
                 <w:rFonts w:ascii="Arial" w:hAnsi="Arial"/>
                 <w:sz w:val="18"/>
               </w:rPr>
-              <w:t>47%</w:t>
+              <w:t>46.9%</w:t>
             </w:r>
           </w:p>
         </w:tc>
@@ -3982,7 +3131,7 @@
                 <w:rFonts w:ascii="Arial" w:hAnsi="Arial"/>
                 <w:sz w:val="18"/>
               </w:rPr>
-              <w:t>5%</w:t>
+              <w:t>4.7%</w:t>
             </w:r>
           </w:p>
         </w:tc>
@@ -4386,7 +3535,7 @@
                 <w:rFonts w:ascii="Arial" w:hAnsi="Arial"/>
                 <w:sz w:val="18"/>
               </w:rPr>
-              <w:t>Doctor Model Reviews</w:t>
+              <w:t>Uro-Oncologist Model Reviews</w:t>
             </w:r>
           </w:p>
         </w:tc>
@@ -4441,7 +3590,7 @@
                 <w:rFonts w:ascii="Arial" w:hAnsi="Arial"/>
                 <w:sz w:val="18"/>
               </w:rPr>
-              <w:t>Doctor Judge Reviews</w:t>
+              <w:t>Uro-Oncologist Judge Reviews</w:t>
             </w:r>
           </w:p>
         </w:tc>
@@ -4486,7 +3635,7 @@
         <w:pStyle w:val="Heading2"/>
       </w:pPr>
       <w:r>
-        <w:t>Doctor Review Scales</w:t>
+        <w:t>Uro-Oncologist Review Scales</w:t>
       </w:r>
     </w:p>
     <w:tbl>
@@ -4610,7 +3759,7 @@
                 <w:rFonts w:ascii="Arial" w:hAnsi="Arial"/>
                 <w:sz w:val="18"/>
               </w:rPr>
-              <w:t>Would the doctor accept this therapy for the patient?</w:t>
+              <w:t>Would the uro-oncologist accept this therapy for the patient?</w:t>
             </w:r>
           </w:p>
         </w:tc>
@@ -5149,7 +4298,7 @@
     </w:p>
     <w:p>
       <w:r>
-        <w:t>All 414 predictions across 69 cases were evaluated by both AI judges. This section shows the automated metrics before any doctor validation.</w:t>
+        <w:t>All 414 predictions across 69 cases were evaluated by both AI judges. This section shows the automated metrics before any uro-oncologist validation.</w:t>
       </w:r>
     </w:p>
     <w:p>
@@ -5159,7 +4308,7 @@
       <w:r>
         <w:drawing>
           <wp:inline xmlns:a="http://schemas.openxmlformats.org/drawingml/2006/main" xmlns:pic="http://schemas.openxmlformats.org/drawingml/2006/picture">
-            <wp:extent cx="5486400" cy="125328"/>
+            <wp:extent cx="5486400" cy="1786538"/>
             <wp:docPr id="2" name="Picture 2"/>
             <wp:cNvGraphicFramePr>
               <a:graphicFrameLocks noChangeAspect="1"/>
@@ -5180,7 +4329,7 @@
                   <pic:spPr>
                     <a:xfrm>
                       <a:off x="0" y="0"/>
-                      <a:ext cx="5486400" cy="125328"/>
+                      <a:ext cx="5486400" cy="1786538"/>
                     </a:xfrm>
                     <a:prstGeom prst="rect"/>
                   </pic:spPr>
@@ -5383,7 +4532,7 @@
                 <w:rFonts w:ascii="Arial" w:hAnsi="Arial"/>
                 <w:sz w:val="18"/>
               </w:rPr>
-              <w:t>6522%</w:t>
+              <w:t>65.2%</w:t>
             </w:r>
           </w:p>
         </w:tc>
@@ -5400,7 +4549,7 @@
                 <w:rFonts w:ascii="Arial" w:hAnsi="Arial"/>
                 <w:sz w:val="18"/>
               </w:rPr>
-              <w:t>4638%</w:t>
+              <w:t>46.4%</w:t>
             </w:r>
           </w:p>
         </w:tc>
@@ -5417,7 +4566,7 @@
                 <w:rFonts w:ascii="Arial" w:hAnsi="Arial"/>
                 <w:sz w:val="18"/>
               </w:rPr>
-              <w:t>6522%</w:t>
+              <w:t>65.2%</w:t>
             </w:r>
           </w:p>
         </w:tc>
@@ -5490,7 +4639,7 @@
                 <w:rFonts w:ascii="Arial" w:hAnsi="Arial"/>
                 <w:sz w:val="18"/>
               </w:rPr>
-              <w:t>6522%</w:t>
+              <w:t>65.2%</w:t>
             </w:r>
           </w:p>
         </w:tc>
@@ -5508,7 +4657,7 @@
                 <w:rFonts w:ascii="Arial" w:hAnsi="Arial"/>
                 <w:sz w:val="18"/>
               </w:rPr>
-              <w:t>3333%</w:t>
+              <w:t>33.3%</w:t>
             </w:r>
           </w:p>
         </w:tc>
@@ -5526,7 +4675,7 @@
                 <w:rFonts w:ascii="Arial" w:hAnsi="Arial"/>
                 <w:sz w:val="18"/>
               </w:rPr>
-              <w:t>6232%</w:t>
+              <w:t>62.3%</w:t>
             </w:r>
           </w:p>
         </w:tc>
@@ -5597,7 +4746,7 @@
                 <w:rFonts w:ascii="Arial" w:hAnsi="Arial"/>
                 <w:sz w:val="18"/>
               </w:rPr>
-              <w:t>6522%</w:t>
+              <w:t>65.2%</w:t>
             </w:r>
           </w:p>
         </w:tc>
@@ -5614,7 +4763,7 @@
                 <w:rFonts w:ascii="Arial" w:hAnsi="Arial"/>
                 <w:sz w:val="18"/>
               </w:rPr>
-              <w:t>3623%</w:t>
+              <w:t>36.2%</w:t>
             </w:r>
           </w:p>
         </w:tc>
@@ -5631,7 +4780,7 @@
                 <w:rFonts w:ascii="Arial" w:hAnsi="Arial"/>
                 <w:sz w:val="18"/>
               </w:rPr>
-              <w:t>5942%</w:t>
+              <w:t>59.4%</w:t>
             </w:r>
           </w:p>
         </w:tc>
@@ -5704,7 +4853,7 @@
                 <w:rFonts w:ascii="Arial" w:hAnsi="Arial"/>
                 <w:sz w:val="18"/>
               </w:rPr>
-              <w:t>6377%</w:t>
+              <w:t>63.8%</w:t>
             </w:r>
           </w:p>
         </w:tc>
@@ -5722,7 +4871,7 @@
                 <w:rFonts w:ascii="Arial" w:hAnsi="Arial"/>
                 <w:sz w:val="18"/>
               </w:rPr>
-              <w:t>3043%</w:t>
+              <w:t>30.4%</w:t>
             </w:r>
           </w:p>
         </w:tc>
@@ -5740,7 +4889,7 @@
                 <w:rFonts w:ascii="Arial" w:hAnsi="Arial"/>
                 <w:sz w:val="18"/>
               </w:rPr>
-              <w:t>5362%</w:t>
+              <w:t>53.6%</w:t>
             </w:r>
           </w:p>
         </w:tc>
@@ -5811,7 +4960,7 @@
                 <w:rFonts w:ascii="Arial" w:hAnsi="Arial"/>
                 <w:sz w:val="18"/>
               </w:rPr>
-              <w:t>5942%</w:t>
+              <w:t>59.4%</w:t>
             </w:r>
           </w:p>
         </w:tc>
@@ -5828,7 +4977,7 @@
                 <w:rFonts w:ascii="Arial" w:hAnsi="Arial"/>
                 <w:sz w:val="18"/>
               </w:rPr>
-              <w:t>2899%</w:t>
+              <w:t>29.0%</w:t>
             </w:r>
           </w:p>
         </w:tc>
@@ -5845,7 +4994,7 @@
                 <w:rFonts w:ascii="Arial" w:hAnsi="Arial"/>
                 <w:sz w:val="18"/>
               </w:rPr>
-              <w:t>4348%</w:t>
+              <w:t>43.5%</w:t>
             </w:r>
           </w:p>
         </w:tc>
@@ -5918,7 +5067,7 @@
                 <w:rFonts w:ascii="Arial" w:hAnsi="Arial"/>
                 <w:sz w:val="18"/>
               </w:rPr>
-              <w:t>6232%</w:t>
+              <w:t>62.3%</w:t>
             </w:r>
           </w:p>
         </w:tc>
@@ -5936,7 +5085,7 @@
                 <w:rFonts w:ascii="Arial" w:hAnsi="Arial"/>
                 <w:sz w:val="18"/>
               </w:rPr>
-              <w:t>1014%</w:t>
+              <w:t>10.1%</w:t>
             </w:r>
           </w:p>
         </w:tc>
@@ -5954,7 +5103,7 @@
                 <w:rFonts w:ascii="Arial" w:hAnsi="Arial"/>
                 <w:sz w:val="18"/>
               </w:rPr>
-              <w:t>4203%</w:t>
+              <w:t>42.0%</w:t>
             </w:r>
           </w:p>
         </w:tc>
@@ -5980,7 +5129,7 @@
     </w:tbl>
     <w:p>
       <w:r>
-        <w:t>Overall: 64% of predictions correctly identified metastatic status. 31% matched the tumor board therapy exactly, while 59% were classified as clinically acceptable (broader than exact match).</w:t>
+        <w:t>Overall: 63.5% of predictions correctly identified metastatic status. 30.9% matched the tumor board therapy exactly, while 58.7% were classified as clinically acceptable (broader than exact match).</w:t>
       </w:r>
     </w:p>
     <w:p>
@@ -6654,730 +5803,7 @@
         <w:pStyle w:val="Heading1"/>
       </w:pPr>
       <w:r>
-        <w:t>8. Performance Across Evaluation Rounds</w:t>
-      </w:r>
-    </w:p>
-    <w:p>
-      <w:r>
-        <w:t>The evaluation pipeline was run twice: January 2026 (initial run, 35 cases with v1.0 schema) and February 2026 (expanded to 69 cases with both v1.0 and v1.1 schemas, improved prompt engineering, and fixed data extraction). Comparing the overlapping metrics reveals significant improvements.</w:t>
-      </w:r>
-    </w:p>
-    <w:p>
-      <w:pPr>
-        <w:jc w:val="center"/>
-      </w:pPr>
-      <w:r>
-        <w:drawing>
-          <wp:inline xmlns:a="http://schemas.openxmlformats.org/drawingml/2006/main" xmlns:pic="http://schemas.openxmlformats.org/drawingml/2006/picture">
-            <wp:extent cx="5486400" cy="2044212"/>
-            <wp:docPr id="3" name="Picture 3"/>
-            <wp:cNvGraphicFramePr>
-              <a:graphicFrameLocks noChangeAspect="1"/>
-            </wp:cNvGraphicFramePr>
-            <a:graphic>
-              <a:graphicData uri="http://schemas.openxmlformats.org/drawingml/2006/picture">
-                <pic:pic>
-                  <pic:nvPicPr>
-                    <pic:cNvPr id="0" name="run_comparison.png"/>
-                    <pic:cNvPicPr/>
-                  </pic:nvPicPr>
-                  <pic:blipFill>
-                    <a:blip r:embed="rId11"/>
-                    <a:stretch>
-                      <a:fillRect/>
-                    </a:stretch>
-                  </pic:blipFill>
-                  <pic:spPr>
-                    <a:xfrm>
-                      <a:off x="0" y="0"/>
-                      <a:ext cx="5486400" cy="2044212"/>
-                    </a:xfrm>
-                    <a:prstGeom prst="rect"/>
-                  </pic:spPr>
-                </pic:pic>
-              </a:graphicData>
-            </a:graphic>
-          </wp:inline>
-        </w:drawing>
-      </w:r>
-    </w:p>
-    <w:p>
-      <w:pPr>
-        <w:pStyle w:val="Heading2"/>
-      </w:pPr>
-      <w:r>
-        <w:t>Per-Model Comparison</w:t>
-      </w:r>
-    </w:p>
-    <w:tbl>
-      <w:tblPr>
-        <w:tblW w:type="auto" w:w="0"/>
-        <w:jc w:val="center"/>
-        <w:tblLook w:firstColumn="1" w:firstRow="1" w:lastColumn="0" w:lastRow="0" w:noHBand="0" w:noVBand="1" w:val="04A0"/>
-      </w:tblPr>
-      <w:tblGrid>
-        <w:gridCol w:w="1728"/>
-        <w:gridCol w:w="1728"/>
-        <w:gridCol w:w="1728"/>
-        <w:gridCol w:w="1728"/>
-        <w:gridCol w:w="1728"/>
-      </w:tblGrid>
-      <w:tr>
-        <w:tc>
-          <w:tcPr>
-            <w:tcW w:type="dxa" w:w="2268"/>
-            <w:shd w:fill="1E40AF"/>
-          </w:tcPr>
-          <w:p>
-            <w:pPr>
-              <w:jc w:val="center"/>
-            </w:pPr>
-            <w:r>
-              <w:rPr>
-                <w:rFonts w:ascii="Arial" w:hAnsi="Arial"/>
-                <w:b/>
-                <w:color w:val="FFFFFF"/>
-                <w:sz w:val="18"/>
-              </w:rPr>
-              <w:t>Model</w:t>
-            </w:r>
-          </w:p>
-        </w:tc>
-        <w:tc>
-          <w:tcPr>
-            <w:tcW w:type="dxa" w:w="1417"/>
-            <w:shd w:fill="1E40AF"/>
-          </w:tcPr>
-          <w:p>
-            <w:pPr>
-              <w:jc w:val="center"/>
-            </w:pPr>
-            <w:r>
-              <w:rPr>
-                <w:rFonts w:ascii="Arial" w:hAnsi="Arial"/>
-                <w:b/>
-                <w:color w:val="FFFFFF"/>
-                <w:sz w:val="18"/>
-              </w:rPr>
-              <w:t>Jan Exact %</w:t>
-            </w:r>
-          </w:p>
-        </w:tc>
-        <w:tc>
-          <w:tcPr>
-            <w:tcW w:type="dxa" w:w="1417"/>
-            <w:shd w:fill="1E40AF"/>
-          </w:tcPr>
-          <w:p>
-            <w:pPr>
-              <w:jc w:val="center"/>
-            </w:pPr>
-            <w:r>
-              <w:rPr>
-                <w:rFonts w:ascii="Arial" w:hAnsi="Arial"/>
-                <w:b/>
-                <w:color w:val="FFFFFF"/>
-                <w:sz w:val="18"/>
-              </w:rPr>
-              <w:t>Feb Exact %</w:t>
-            </w:r>
-          </w:p>
-        </w:tc>
-        <w:tc>
-          <w:tcPr>
-            <w:tcW w:type="dxa" w:w="1417"/>
-            <w:shd w:fill="1E40AF"/>
-          </w:tcPr>
-          <w:p>
-            <w:pPr>
-              <w:jc w:val="center"/>
-            </w:pPr>
-            <w:r>
-              <w:rPr>
-                <w:rFonts w:ascii="Arial" w:hAnsi="Arial"/>
-                <w:b/>
-                <w:color w:val="FFFFFF"/>
-                <w:sz w:val="18"/>
-              </w:rPr>
-              <w:t>Jan Accept %</w:t>
-            </w:r>
-          </w:p>
-        </w:tc>
-        <w:tc>
-          <w:tcPr>
-            <w:tcW w:type="dxa" w:w="1417"/>
-            <w:shd w:fill="1E40AF"/>
-          </w:tcPr>
-          <w:p>
-            <w:pPr>
-              <w:jc w:val="center"/>
-            </w:pPr>
-            <w:r>
-              <w:rPr>
-                <w:rFonts w:ascii="Arial" w:hAnsi="Arial"/>
-                <w:b/>
-                <w:color w:val="FFFFFF"/>
-                <w:sz w:val="18"/>
-              </w:rPr>
-              <w:t>Feb Accept %</w:t>
-            </w:r>
-          </w:p>
-        </w:tc>
-      </w:tr>
-      <w:tr>
-        <w:tc>
-          <w:tcPr>
-            <w:tcW w:type="dxa" w:w="2268"/>
-          </w:tcPr>
-          <w:p>
-            <w:pPr>
-              <w:jc w:val="center"/>
-            </w:pPr>
-            <w:r>
-              <w:rPr>
-                <w:rFonts w:ascii="Arial" w:hAnsi="Arial"/>
-                <w:sz w:val="18"/>
-              </w:rPr>
-              <w:t>Meditron3 7B</w:t>
-            </w:r>
-          </w:p>
-        </w:tc>
-        <w:tc>
-          <w:tcPr>
-            <w:tcW w:type="dxa" w:w="1417"/>
-          </w:tcPr>
-          <w:p>
-            <w:pPr>
-              <w:jc w:val="center"/>
-            </w:pPr>
-            <w:r>
-              <w:rPr>
-                <w:rFonts w:ascii="Arial" w:hAnsi="Arial"/>
-                <w:sz w:val="18"/>
-              </w:rPr>
-              <w:t>9%</w:t>
-            </w:r>
-          </w:p>
-        </w:tc>
-        <w:tc>
-          <w:tcPr>
-            <w:tcW w:type="dxa" w:w="1417"/>
-          </w:tcPr>
-          <w:p>
-            <w:pPr>
-              <w:jc w:val="center"/>
-            </w:pPr>
-            <w:r>
-              <w:rPr>
-                <w:rFonts w:ascii="Arial" w:hAnsi="Arial"/>
-                <w:sz w:val="18"/>
-              </w:rPr>
-              <w:t>0%</w:t>
-            </w:r>
-          </w:p>
-        </w:tc>
-        <w:tc>
-          <w:tcPr>
-            <w:tcW w:type="dxa" w:w="1417"/>
-          </w:tcPr>
-          <w:p>
-            <w:pPr>
-              <w:jc w:val="center"/>
-            </w:pPr>
-            <w:r>
-              <w:rPr>
-                <w:rFonts w:ascii="Arial" w:hAnsi="Arial"/>
-                <w:sz w:val="18"/>
-              </w:rPr>
-              <w:t>26%</w:t>
-            </w:r>
-          </w:p>
-        </w:tc>
-        <w:tc>
-          <w:tcPr>
-            <w:tcW w:type="dxa" w:w="1417"/>
-          </w:tcPr>
-          <w:p>
-            <w:pPr>
-              <w:jc w:val="center"/>
-            </w:pPr>
-            <w:r>
-              <w:rPr>
-                <w:rFonts w:ascii="Arial" w:hAnsi="Arial"/>
-                <w:sz w:val="18"/>
-              </w:rPr>
-              <w:t>100%</w:t>
-            </w:r>
-          </w:p>
-        </w:tc>
-      </w:tr>
-      <w:tr>
-        <w:tc>
-          <w:tcPr>
-            <w:tcW w:type="dxa" w:w="2268"/>
-            <w:shd w:fill="F0F4FF"/>
-          </w:tcPr>
-          <w:p>
-            <w:pPr>
-              <w:jc w:val="center"/>
-            </w:pPr>
-            <w:r>
-              <w:rPr>
-                <w:rFonts w:ascii="Arial" w:hAnsi="Arial"/>
-                <w:sz w:val="18"/>
-              </w:rPr>
-              <w:t>OLMo 32B Instruct</w:t>
-            </w:r>
-          </w:p>
-        </w:tc>
-        <w:tc>
-          <w:tcPr>
-            <w:tcW w:type="dxa" w:w="1417"/>
-            <w:shd w:fill="F0F4FF"/>
-          </w:tcPr>
-          <w:p>
-            <w:pPr>
-              <w:jc w:val="center"/>
-            </w:pPr>
-            <w:r>
-              <w:rPr>
-                <w:rFonts w:ascii="Arial" w:hAnsi="Arial"/>
-                <w:sz w:val="18"/>
-              </w:rPr>
-              <w:t>14%</w:t>
-            </w:r>
-          </w:p>
-        </w:tc>
-        <w:tc>
-          <w:tcPr>
-            <w:tcW w:type="dxa" w:w="1417"/>
-            <w:shd w:fill="F0F4FF"/>
-          </w:tcPr>
-          <w:p>
-            <w:pPr>
-              <w:jc w:val="center"/>
-            </w:pPr>
-            <w:r>
-              <w:rPr>
-                <w:rFonts w:ascii="Arial" w:hAnsi="Arial"/>
-                <w:sz w:val="18"/>
-              </w:rPr>
-              <w:t>0%</w:t>
-            </w:r>
-          </w:p>
-        </w:tc>
-        <w:tc>
-          <w:tcPr>
-            <w:tcW w:type="dxa" w:w="1417"/>
-            <w:shd w:fill="F0F4FF"/>
-          </w:tcPr>
-          <w:p>
-            <w:pPr>
-              <w:jc w:val="center"/>
-            </w:pPr>
-            <w:r>
-              <w:rPr>
-                <w:rFonts w:ascii="Arial" w:hAnsi="Arial"/>
-                <w:sz w:val="18"/>
-              </w:rPr>
-              <w:t>20%</w:t>
-            </w:r>
-          </w:p>
-        </w:tc>
-        <w:tc>
-          <w:tcPr>
-            <w:tcW w:type="dxa" w:w="1417"/>
-            <w:shd w:fill="F0F4FF"/>
-          </w:tcPr>
-          <w:p>
-            <w:pPr>
-              <w:jc w:val="center"/>
-            </w:pPr>
-            <w:r>
-              <w:rPr>
-                <w:rFonts w:ascii="Arial" w:hAnsi="Arial"/>
-                <w:sz w:val="18"/>
-              </w:rPr>
-              <w:t>100%</w:t>
-            </w:r>
-          </w:p>
-        </w:tc>
-      </w:tr>
-      <w:tr>
-        <w:tc>
-          <w:tcPr>
-            <w:tcW w:type="dxa" w:w="2268"/>
-          </w:tcPr>
-          <w:p>
-            <w:pPr>
-              <w:jc w:val="center"/>
-            </w:pPr>
-            <w:r>
-              <w:rPr>
-                <w:rFonts w:ascii="Arial" w:hAnsi="Arial"/>
-                <w:sz w:val="18"/>
-              </w:rPr>
-              <w:t>OLMo 32B Think</w:t>
-            </w:r>
-          </w:p>
-        </w:tc>
-        <w:tc>
-          <w:tcPr>
-            <w:tcW w:type="dxa" w:w="1417"/>
-          </w:tcPr>
-          <w:p>
-            <w:pPr>
-              <w:jc w:val="center"/>
-            </w:pPr>
-            <w:r>
-              <w:rPr>
-                <w:rFonts w:ascii="Arial" w:hAnsi="Arial"/>
-                <w:sz w:val="18"/>
-              </w:rPr>
-              <w:t>23%</w:t>
-            </w:r>
-          </w:p>
-        </w:tc>
-        <w:tc>
-          <w:tcPr>
-            <w:tcW w:type="dxa" w:w="1417"/>
-          </w:tcPr>
-          <w:p>
-            <w:pPr>
-              <w:jc w:val="center"/>
-            </w:pPr>
-            <w:r>
-              <w:rPr>
-                <w:rFonts w:ascii="Arial" w:hAnsi="Arial"/>
-                <w:sz w:val="18"/>
-              </w:rPr>
-              <w:t>0%</w:t>
-            </w:r>
-          </w:p>
-        </w:tc>
-        <w:tc>
-          <w:tcPr>
-            <w:tcW w:type="dxa" w:w="1417"/>
-          </w:tcPr>
-          <w:p>
-            <w:pPr>
-              <w:jc w:val="center"/>
-            </w:pPr>
-            <w:r>
-              <w:rPr>
-                <w:rFonts w:ascii="Arial" w:hAnsi="Arial"/>
-                <w:sz w:val="18"/>
-              </w:rPr>
-              <w:t>23%</w:t>
-            </w:r>
-          </w:p>
-        </w:tc>
-        <w:tc>
-          <w:tcPr>
-            <w:tcW w:type="dxa" w:w="1417"/>
-          </w:tcPr>
-          <w:p>
-            <w:pPr>
-              <w:jc w:val="center"/>
-            </w:pPr>
-            <w:r>
-              <w:rPr>
-                <w:rFonts w:ascii="Arial" w:hAnsi="Arial"/>
-                <w:sz w:val="18"/>
-              </w:rPr>
-              <w:t>100%</w:t>
-            </w:r>
-          </w:p>
-        </w:tc>
-      </w:tr>
-      <w:tr>
-        <w:tc>
-          <w:tcPr>
-            <w:tcW w:type="dxa" w:w="2268"/>
-            <w:shd w:fill="F0F4FF"/>
-          </w:tcPr>
-          <w:p>
-            <w:pPr>
-              <w:jc w:val="center"/>
-            </w:pPr>
-            <w:r>
-              <w:rPr>
-                <w:rFonts w:ascii="Arial" w:hAnsi="Arial"/>
-                <w:sz w:val="18"/>
-              </w:rPr>
-              <w:t>Gemma 3 27B</w:t>
-            </w:r>
-          </w:p>
-        </w:tc>
-        <w:tc>
-          <w:tcPr>
-            <w:tcW w:type="dxa" w:w="1417"/>
-            <w:shd w:fill="F0F4FF"/>
-          </w:tcPr>
-          <w:p>
-            <w:pPr>
-              <w:jc w:val="center"/>
-            </w:pPr>
-            <w:r>
-              <w:rPr>
-                <w:rFonts w:ascii="Arial" w:hAnsi="Arial"/>
-                <w:sz w:val="18"/>
-              </w:rPr>
-              <w:t>29%</w:t>
-            </w:r>
-          </w:p>
-        </w:tc>
-        <w:tc>
-          <w:tcPr>
-            <w:tcW w:type="dxa" w:w="1417"/>
-            <w:shd w:fill="F0F4FF"/>
-          </w:tcPr>
-          <w:p>
-            <w:pPr>
-              <w:jc w:val="center"/>
-            </w:pPr>
-            <w:r>
-              <w:rPr>
-                <w:rFonts w:ascii="Arial" w:hAnsi="Arial"/>
-                <w:sz w:val="18"/>
-              </w:rPr>
-              <w:t>0%</w:t>
-            </w:r>
-          </w:p>
-        </w:tc>
-        <w:tc>
-          <w:tcPr>
-            <w:tcW w:type="dxa" w:w="1417"/>
-            <w:shd w:fill="F0F4FF"/>
-          </w:tcPr>
-          <w:p>
-            <w:pPr>
-              <w:jc w:val="center"/>
-            </w:pPr>
-            <w:r>
-              <w:rPr>
-                <w:rFonts w:ascii="Arial" w:hAnsi="Arial"/>
-                <w:sz w:val="18"/>
-              </w:rPr>
-              <w:t>31%</w:t>
-            </w:r>
-          </w:p>
-        </w:tc>
-        <w:tc>
-          <w:tcPr>
-            <w:tcW w:type="dxa" w:w="1417"/>
-            <w:shd w:fill="F0F4FF"/>
-          </w:tcPr>
-          <w:p>
-            <w:pPr>
-              <w:jc w:val="center"/>
-            </w:pPr>
-            <w:r>
-              <w:rPr>
-                <w:rFonts w:ascii="Arial" w:hAnsi="Arial"/>
-                <w:sz w:val="18"/>
-              </w:rPr>
-              <w:t>100%</w:t>
-            </w:r>
-          </w:p>
-        </w:tc>
-      </w:tr>
-      <w:tr>
-        <w:tc>
-          <w:tcPr>
-            <w:tcW w:type="dxa" w:w="2268"/>
-          </w:tcPr>
-          <w:p>
-            <w:pPr>
-              <w:jc w:val="center"/>
-            </w:pPr>
-            <w:r>
-              <w:rPr>
-                <w:rFonts w:ascii="Arial" w:hAnsi="Arial"/>
-                <w:sz w:val="18"/>
-              </w:rPr>
-              <w:t>Gemma 3 4B</w:t>
-            </w:r>
-          </w:p>
-        </w:tc>
-        <w:tc>
-          <w:tcPr>
-            <w:tcW w:type="dxa" w:w="1417"/>
-          </w:tcPr>
-          <w:p>
-            <w:pPr>
-              <w:jc w:val="center"/>
-            </w:pPr>
-            <w:r>
-              <w:rPr>
-                <w:rFonts w:ascii="Arial" w:hAnsi="Arial"/>
-                <w:sz w:val="18"/>
-              </w:rPr>
-              <w:t>17%</w:t>
-            </w:r>
-          </w:p>
-        </w:tc>
-        <w:tc>
-          <w:tcPr>
-            <w:tcW w:type="dxa" w:w="1417"/>
-          </w:tcPr>
-          <w:p>
-            <w:pPr>
-              <w:jc w:val="center"/>
-            </w:pPr>
-            <w:r>
-              <w:rPr>
-                <w:rFonts w:ascii="Arial" w:hAnsi="Arial"/>
-                <w:sz w:val="18"/>
-              </w:rPr>
-              <w:t>0%</w:t>
-            </w:r>
-          </w:p>
-        </w:tc>
-        <w:tc>
-          <w:tcPr>
-            <w:tcW w:type="dxa" w:w="1417"/>
-          </w:tcPr>
-          <w:p>
-            <w:pPr>
-              <w:jc w:val="center"/>
-            </w:pPr>
-            <w:r>
-              <w:rPr>
-                <w:rFonts w:ascii="Arial" w:hAnsi="Arial"/>
-                <w:sz w:val="18"/>
-              </w:rPr>
-              <w:t>20%</w:t>
-            </w:r>
-          </w:p>
-        </w:tc>
-        <w:tc>
-          <w:tcPr>
-            <w:tcW w:type="dxa" w:w="1417"/>
-          </w:tcPr>
-          <w:p>
-            <w:pPr>
-              <w:jc w:val="center"/>
-            </w:pPr>
-            <w:r>
-              <w:rPr>
-                <w:rFonts w:ascii="Arial" w:hAnsi="Arial"/>
-                <w:sz w:val="18"/>
-              </w:rPr>
-              <w:t>100%</w:t>
-            </w:r>
-          </w:p>
-        </w:tc>
-      </w:tr>
-      <w:tr>
-        <w:tc>
-          <w:tcPr>
-            <w:tcW w:type="dxa" w:w="2268"/>
-            <w:shd w:fill="F0F4FF"/>
-          </w:tcPr>
-          <w:p>
-            <w:pPr>
-              <w:jc w:val="center"/>
-            </w:pPr>
-            <w:r>
-              <w:rPr>
-                <w:rFonts w:ascii="Arial" w:hAnsi="Arial"/>
-                <w:sz w:val="18"/>
-              </w:rPr>
-              <w:t>MedGemma 27B</w:t>
-            </w:r>
-          </w:p>
-        </w:tc>
-        <w:tc>
-          <w:tcPr>
-            <w:tcW w:type="dxa" w:w="1417"/>
-            <w:shd w:fill="F0F4FF"/>
-          </w:tcPr>
-          <w:p>
-            <w:pPr>
-              <w:jc w:val="center"/>
-            </w:pPr>
-            <w:r>
-              <w:rPr>
-                <w:rFonts w:ascii="Arial" w:hAnsi="Arial"/>
-                <w:sz w:val="18"/>
-              </w:rPr>
-              <w:t>37%</w:t>
-            </w:r>
-          </w:p>
-        </w:tc>
-        <w:tc>
-          <w:tcPr>
-            <w:tcW w:type="dxa" w:w="1417"/>
-            <w:shd w:fill="F0F4FF"/>
-          </w:tcPr>
-          <w:p>
-            <w:pPr>
-              <w:jc w:val="center"/>
-            </w:pPr>
-            <w:r>
-              <w:rPr>
-                <w:rFonts w:ascii="Arial" w:hAnsi="Arial"/>
-                <w:sz w:val="18"/>
-              </w:rPr>
-              <w:t>0%</w:t>
-            </w:r>
-          </w:p>
-        </w:tc>
-        <w:tc>
-          <w:tcPr>
-            <w:tcW w:type="dxa" w:w="1417"/>
-            <w:shd w:fill="F0F4FF"/>
-          </w:tcPr>
-          <w:p>
-            <w:pPr>
-              <w:jc w:val="center"/>
-            </w:pPr>
-            <w:r>
-              <w:rPr>
-                <w:rFonts w:ascii="Arial" w:hAnsi="Arial"/>
-                <w:sz w:val="18"/>
-              </w:rPr>
-              <w:t>31%</w:t>
-            </w:r>
-          </w:p>
-        </w:tc>
-        <w:tc>
-          <w:tcPr>
-            <w:tcW w:type="dxa" w:w="1417"/>
-            <w:shd w:fill="F0F4FF"/>
-          </w:tcPr>
-          <w:p>
-            <w:pPr>
-              <w:jc w:val="center"/>
-            </w:pPr>
-            <w:r>
-              <w:rPr>
-                <w:rFonts w:ascii="Arial" w:hAnsi="Arial"/>
-                <w:sz w:val="18"/>
-              </w:rPr>
-              <w:t>100%</w:t>
-            </w:r>
-          </w:p>
-        </w:tc>
-      </w:tr>
-    </w:tbl>
-    <w:p>
-      <w:r>
-        <w:t>Average improvement across all models: +-21 percentage points in exact match rate, +75 percentage points in clinically acceptable rate. Key drivers include: improved prompt engineering with explicit German medical terminology, fixed ECOG/Karnofsky extraction for v1.0 schema cases, and increased max_tokens for thinking models.</w:t>
-      </w:r>
-    </w:p>
-    <w:p>
-      <w:r>
-        <w:br w:type="page"/>
-      </w:r>
-    </w:p>
-    <w:p>
-      <w:pPr>
-        <w:pStyle w:val="Heading1"/>
-      </w:pPr>
-      <w:r>
-        <w:t>9. Therapy Category Analysis</w:t>
+        <w:t>8. Therapy Category Analysis</w:t>
       </w:r>
     </w:p>
     <w:p>
@@ -7393,7 +5819,7 @@
         <w:drawing>
           <wp:inline xmlns:a="http://schemas.openxmlformats.org/drawingml/2006/main" xmlns:pic="http://schemas.openxmlformats.org/drawingml/2006/picture">
             <wp:extent cx="5486400" cy="2237711"/>
-            <wp:docPr id="4" name="Picture 4"/>
+            <wp:docPr id="3" name="Picture 3"/>
             <wp:cNvGraphicFramePr>
               <a:graphicFrameLocks noChangeAspect="1"/>
             </wp:cNvGraphicFramePr>
@@ -7405,7 +5831,7 @@
                     <pic:cNvPicPr/>
                   </pic:nvPicPr>
                   <pic:blipFill>
-                    <a:blip r:embed="rId12"/>
+                    <a:blip r:embed="rId11"/>
                     <a:stretch>
                       <a:fillRect/>
                     </a:stretch>
@@ -7545,7 +5971,7 @@
                 <w:rFonts w:ascii="Arial" w:hAnsi="Arial"/>
                 <w:sz w:val="18"/>
               </w:rPr>
-              <w:t>40%</w:t>
+              <w:t>39.9%</w:t>
             </w:r>
           </w:p>
         </w:tc>
@@ -7601,7 +6027,7 @@
                 <w:rFonts w:ascii="Arial" w:hAnsi="Arial"/>
                 <w:sz w:val="18"/>
               </w:rPr>
-              <w:t>33%</w:t>
+              <w:t>32.9%</w:t>
             </w:r>
           </w:p>
         </w:tc>
@@ -7654,7 +6080,7 @@
                 <w:rFonts w:ascii="Arial" w:hAnsi="Arial"/>
                 <w:sz w:val="18"/>
               </w:rPr>
-              <w:t>17%</w:t>
+              <w:t>16.7%</w:t>
             </w:r>
           </w:p>
         </w:tc>
@@ -7710,7 +6136,7 @@
                 <w:rFonts w:ascii="Arial" w:hAnsi="Arial"/>
                 <w:sz w:val="18"/>
               </w:rPr>
-              <w:t>4%</w:t>
+              <w:t>3.9%</w:t>
             </w:r>
           </w:p>
         </w:tc>
@@ -7763,7 +6189,7 @@
                 <w:rFonts w:ascii="Arial" w:hAnsi="Arial"/>
                 <w:sz w:val="18"/>
               </w:rPr>
-              <w:t>2%</w:t>
+              <w:t>2.4%</w:t>
             </w:r>
           </w:p>
         </w:tc>
@@ -7819,7 +6245,7 @@
                 <w:rFonts w:ascii="Arial" w:hAnsi="Arial"/>
                 <w:sz w:val="18"/>
               </w:rPr>
-              <w:t>2%</w:t>
+              <w:t>2.2%</w:t>
             </w:r>
           </w:p>
         </w:tc>
@@ -7872,7 +6298,7 @@
                 <w:rFonts w:ascii="Arial" w:hAnsi="Arial"/>
                 <w:sz w:val="18"/>
               </w:rPr>
-              <w:t>2%</w:t>
+              <w:t>1.9%</w:t>
             </w:r>
           </w:p>
         </w:tc>
@@ -7928,7 +6354,7 @@
                 <w:rFonts w:ascii="Arial" w:hAnsi="Arial"/>
                 <w:sz w:val="18"/>
               </w:rPr>
-              <w:t>0%</w:t>
+              <w:t>0.2%</w:t>
             </w:r>
           </w:p>
         </w:tc>
@@ -7949,12 +6375,12 @@
         <w:pStyle w:val="Heading1"/>
       </w:pPr>
       <w:r>
-        <w:t>10. Model Performance — Doctor Review</w:t>
+        <w:t>9. Model Performance — Uro-Oncologist Review</w:t>
       </w:r>
     </w:p>
     <w:p>
       <w:r>
-        <w:t>Dr. Alexa reviewed 414 model predictions across 69 cases in a blinded fashion, providing expert assessment on therapy acceptability, exact match, patient orientation, and overall quality.</w:t>
+        <w:t>Dr. Alexa reviewed 414 model predictions across 69 cases, providing expert assessment on therapy acceptability, exact match, patient orientation, and overall quality.</w:t>
       </w:r>
     </w:p>
     <w:p>
@@ -7973,7 +6399,7 @@
         <w:drawing>
           <wp:inline xmlns:a="http://schemas.openxmlformats.org/drawingml/2006/main" xmlns:pic="http://schemas.openxmlformats.org/drawingml/2006/picture">
             <wp:extent cx="5486400" cy="3026819"/>
-            <wp:docPr id="5" name="Picture 5"/>
+            <wp:docPr id="4" name="Picture 4"/>
             <wp:cNvGraphicFramePr>
               <a:graphicFrameLocks noChangeAspect="1"/>
             </wp:cNvGraphicFramePr>
@@ -7985,7 +6411,7 @@
                     <pic:cNvPicPr/>
                   </pic:nvPicPr>
                   <pic:blipFill>
-                    <a:blip r:embed="rId13"/>
+                    <a:blip r:embed="rId12"/>
                     <a:stretch>
                       <a:fillRect/>
                     </a:stretch>
@@ -8020,7 +6446,7 @@
         <w:drawing>
           <wp:inline xmlns:a="http://schemas.openxmlformats.org/drawingml/2006/main" xmlns:pic="http://schemas.openxmlformats.org/drawingml/2006/picture">
             <wp:extent cx="5486400" cy="3026819"/>
-            <wp:docPr id="6" name="Picture 6"/>
+            <wp:docPr id="5" name="Picture 5"/>
             <wp:cNvGraphicFramePr>
               <a:graphicFrameLocks noChangeAspect="1"/>
             </wp:cNvGraphicFramePr>
@@ -8032,7 +6458,7 @@
                     <pic:cNvPicPr/>
                   </pic:nvPicPr>
                   <pic:blipFill>
-                    <a:blip r:embed="rId14"/>
+                    <a:blip r:embed="rId13"/>
                     <a:stretch>
                       <a:fillRect/>
                     </a:stretch>
@@ -8056,7 +6482,7 @@
         <w:pStyle w:val="Heading2"/>
       </w:pPr>
       <w:r>
-        <w:t>Doctor Review Summary</w:t>
+        <w:t>Uro-Oncologist Review Summary</w:t>
       </w:r>
     </w:p>
     <w:tbl>
@@ -8243,7 +6669,7 @@
                 <w:rFonts w:ascii="Arial" w:hAnsi="Arial"/>
                 <w:sz w:val="18"/>
               </w:rPr>
-              <w:t>75%</w:t>
+              <w:t>75.4%</w:t>
             </w:r>
           </w:p>
         </w:tc>
@@ -8260,7 +6686,7 @@
                 <w:rFonts w:ascii="Arial" w:hAnsi="Arial"/>
                 <w:sz w:val="18"/>
               </w:rPr>
-              <w:t>64</w:t>
+              <w:t>63.8</w:t>
             </w:r>
           </w:p>
         </w:tc>
@@ -8277,7 +6703,7 @@
                 <w:rFonts w:ascii="Arial" w:hAnsi="Arial"/>
                 <w:sz w:val="18"/>
               </w:rPr>
-              <w:t>63</w:t>
+              <w:t>63.5</w:t>
             </w:r>
           </w:p>
         </w:tc>
@@ -8350,7 +6776,7 @@
                 <w:rFonts w:ascii="Arial" w:hAnsi="Arial"/>
                 <w:sz w:val="18"/>
               </w:rPr>
-              <w:t>75%</w:t>
+              <w:t>74.6%</w:t>
             </w:r>
           </w:p>
         </w:tc>
@@ -8368,7 +6794,7 @@
                 <w:rFonts w:ascii="Arial" w:hAnsi="Arial"/>
                 <w:sz w:val="18"/>
               </w:rPr>
-              <w:t>62</w:t>
+              <w:t>61.8</w:t>
             </w:r>
           </w:p>
         </w:tc>
@@ -8386,7 +6812,7 @@
                 <w:rFonts w:ascii="Arial" w:hAnsi="Arial"/>
                 <w:sz w:val="18"/>
               </w:rPr>
-              <w:t>62</w:t>
+              <w:t>61.8</w:t>
             </w:r>
           </w:p>
         </w:tc>
@@ -8457,7 +6883,7 @@
                 <w:rFonts w:ascii="Arial" w:hAnsi="Arial"/>
                 <w:sz w:val="18"/>
               </w:rPr>
-              <w:t>64%</w:t>
+              <w:t>63.8%</w:t>
             </w:r>
           </w:p>
         </w:tc>
@@ -8474,7 +6900,7 @@
                 <w:rFonts w:ascii="Arial" w:hAnsi="Arial"/>
                 <w:sz w:val="18"/>
               </w:rPr>
-              <w:t>50</w:t>
+              <w:t>49.8</w:t>
             </w:r>
           </w:p>
         </w:tc>
@@ -8491,7 +6917,7 @@
                 <w:rFonts w:ascii="Arial" w:hAnsi="Arial"/>
                 <w:sz w:val="18"/>
               </w:rPr>
-              <w:t>51</w:t>
+              <w:t>50.6</w:t>
             </w:r>
           </w:p>
         </w:tc>
@@ -8564,7 +6990,7 @@
                 <w:rFonts w:ascii="Arial" w:hAnsi="Arial"/>
                 <w:sz w:val="18"/>
               </w:rPr>
-              <w:t>69%</w:t>
+              <w:t>69.1%</w:t>
             </w:r>
           </w:p>
         </w:tc>
@@ -8582,7 +7008,7 @@
                 <w:rFonts w:ascii="Arial" w:hAnsi="Arial"/>
                 <w:sz w:val="18"/>
               </w:rPr>
-              <w:t>54</w:t>
+              <w:t>54.1</w:t>
             </w:r>
           </w:p>
         </w:tc>
@@ -8600,7 +7026,7 @@
                 <w:rFonts w:ascii="Arial" w:hAnsi="Arial"/>
                 <w:sz w:val="18"/>
               </w:rPr>
-              <w:t>54</w:t>
+              <w:t>54.1</w:t>
             </w:r>
           </w:p>
         </w:tc>
@@ -8671,7 +7097,7 @@
                 <w:rFonts w:ascii="Arial" w:hAnsi="Arial"/>
                 <w:sz w:val="18"/>
               </w:rPr>
-              <w:t>49%</w:t>
+              <w:t>49.3%</w:t>
             </w:r>
           </w:p>
         </w:tc>
@@ -8688,7 +7114,7 @@
                 <w:rFonts w:ascii="Arial" w:hAnsi="Arial"/>
                 <w:sz w:val="18"/>
               </w:rPr>
-              <w:t>41</w:t>
+              <w:t>41.1</w:t>
             </w:r>
           </w:p>
         </w:tc>
@@ -8705,7 +7131,7 @@
                 <w:rFonts w:ascii="Arial" w:hAnsi="Arial"/>
                 <w:sz w:val="18"/>
               </w:rPr>
-              <w:t>41</w:t>
+              <w:t>41.2</w:t>
             </w:r>
           </w:p>
         </w:tc>
@@ -8778,7 +7204,7 @@
                 <w:rFonts w:ascii="Arial" w:hAnsi="Arial"/>
                 <w:sz w:val="18"/>
               </w:rPr>
-              <w:t>48%</w:t>
+              <w:t>47.8%</w:t>
             </w:r>
           </w:p>
         </w:tc>
@@ -8796,7 +7222,7 @@
                 <w:rFonts w:ascii="Arial" w:hAnsi="Arial"/>
                 <w:sz w:val="18"/>
               </w:rPr>
-              <w:t>40</w:t>
+              <w:t>39.9</w:t>
             </w:r>
           </w:p>
         </w:tc>
@@ -8814,7 +7240,7 @@
                 <w:rFonts w:ascii="Arial" w:hAnsi="Arial"/>
                 <w:sz w:val="18"/>
               </w:rPr>
-              <w:t>40</w:t>
+              <w:t>39.9</w:t>
             </w:r>
           </w:p>
         </w:tc>
@@ -8848,7 +7274,7 @@
         <w:pStyle w:val="Heading1"/>
       </w:pPr>
       <w:r>
-        <w:t>11. Case Studies</w:t>
+        <w:t>10. Case Studies</w:t>
       </w:r>
     </w:p>
     <w:p>
@@ -9963,7 +8389,7 @@
         <w:pStyle w:val="Heading2"/>
       </w:pPr>
       <w:r>
-        <w:t>Case Study C: Doctor–Judge Divergence</w:t>
+        <w:t>Case Study C: Uro-Oncologist–Judge Divergence</w:t>
       </w:r>
     </w:p>
     <w:p>
@@ -10519,7 +8945,7 @@
         <w:pStyle w:val="Heading1"/>
       </w:pPr>
       <w:r>
-        <w:t>12. Judge Score Distributions</w:t>
+        <w:t>11. Judge Score Distributions</w:t>
       </w:r>
     </w:p>
     <w:p>
@@ -10543,7 +8969,7 @@
         <w:drawing>
           <wp:inline xmlns:a="http://schemas.openxmlformats.org/drawingml/2006/main" xmlns:pic="http://schemas.openxmlformats.org/drawingml/2006/picture">
             <wp:extent cx="5486400" cy="2391747"/>
-            <wp:docPr id="7" name="Picture 7"/>
+            <wp:docPr id="6" name="Picture 6"/>
             <wp:cNvGraphicFramePr>
               <a:graphicFrameLocks noChangeAspect="1"/>
             </wp:cNvGraphicFramePr>
@@ -10555,7 +8981,7 @@
                     <pic:cNvPicPr/>
                   </pic:nvPicPr>
                   <pic:blipFill>
-                    <a:blip r:embed="rId15"/>
+                    <a:blip r:embed="rId14"/>
                     <a:stretch>
                       <a:fillRect/>
                     </a:stretch>
@@ -10590,7 +9016,7 @@
         <w:drawing>
           <wp:inline xmlns:a="http://schemas.openxmlformats.org/drawingml/2006/main" xmlns:pic="http://schemas.openxmlformats.org/drawingml/2006/picture">
             <wp:extent cx="5486400" cy="1625600"/>
-            <wp:docPr id="8" name="Picture 8"/>
+            <wp:docPr id="7" name="Picture 7"/>
             <wp:cNvGraphicFramePr>
               <a:graphicFrameLocks noChangeAspect="1"/>
             </wp:cNvGraphicFramePr>
@@ -10602,7 +9028,7 @@
                     <pic:cNvPicPr/>
                   </pic:nvPicPr>
                   <pic:blipFill>
-                    <a:blip r:embed="rId16"/>
+                    <a:blip r:embed="rId15"/>
                     <a:stretch>
                       <a:fillRect/>
                     </a:stretch>
@@ -11793,12 +10219,12 @@
         <w:pStyle w:val="Heading1"/>
       </w:pPr>
       <w:r>
-        <w:t>13. Agreement: Doctor vs AI Judge</w:t>
+        <w:t>12. Agreement: Uro-Oncologist vs AI Judge</w:t>
       </w:r>
     </w:p>
     <w:p>
       <w:r>
-        <w:t>Agreement analysis based on 69 cases with complete doctor reviews and judge evaluations (407 prediction–evaluation pairs per judge). Cohen's Kappa measures agreement beyond chance between the doctor's therapy acceptability rating and the judge's correctness verdict.</w:t>
+        <w:t>Agreement analysis based on 69 cases with complete uro-oncologist reviews and judge evaluations (407 prediction–evaluation pairs per judge). Cohen's Kappa measures agreement beyond chance between the uro-oncologist's therapy acceptability rating and the judge's correctness verdict.</w:t>
       </w:r>
     </w:p>
     <w:p>
@@ -11817,7 +10243,7 @@
         <w:drawing>
           <wp:inline xmlns:a="http://schemas.openxmlformats.org/drawingml/2006/main" xmlns:pic="http://schemas.openxmlformats.org/drawingml/2006/picture">
             <wp:extent cx="5486400" cy="2282906"/>
-            <wp:docPr id="9" name="Picture 9"/>
+            <wp:docPr id="8" name="Picture 8"/>
             <wp:cNvGraphicFramePr>
               <a:graphicFrameLocks noChangeAspect="1"/>
             </wp:cNvGraphicFramePr>
@@ -11829,7 +10255,7 @@
                     <pic:cNvPicPr/>
                   </pic:nvPicPr>
                   <pic:blipFill>
-                    <a:blip r:embed="rId17"/>
+                    <a:blip r:embed="rId16"/>
                     <a:stretch>
                       <a:fillRect/>
                     </a:stretch>
@@ -12331,409 +10757,7 @@
         <w:pStyle w:val="Heading1"/>
       </w:pPr>
       <w:r>
-        <w:t>14. Score Correlations</w:t>
-      </w:r>
-    </w:p>
-    <w:p>
-      <w:r>
-        <w:t>Spearman rank correlations measure how well judge scores track the doctor's ratings. Top row: judge overall score vs doctor's prediction quality (0–9). Bottom row: judge overall score vs doctor's exact match rating (0–100).</w:t>
-      </w:r>
-    </w:p>
-    <w:p>
-      <w:pPr>
-        <w:jc w:val="center"/>
-      </w:pPr>
-      <w:r>
-        <w:drawing>
-          <wp:inline xmlns:a="http://schemas.openxmlformats.org/drawingml/2006/main" xmlns:pic="http://schemas.openxmlformats.org/drawingml/2006/picture">
-            <wp:extent cx="5486400" cy="4557761"/>
-            <wp:docPr id="10" name="Picture 10"/>
-            <wp:cNvGraphicFramePr>
-              <a:graphicFrameLocks noChangeAspect="1"/>
-            </wp:cNvGraphicFramePr>
-            <a:graphic>
-              <a:graphicData uri="http://schemas.openxmlformats.org/drawingml/2006/picture">
-                <pic:pic>
-                  <pic:nvPicPr>
-                    <pic:cNvPr id="0" name="scatter_correlations.png"/>
-                    <pic:cNvPicPr/>
-                  </pic:nvPicPr>
-                  <pic:blipFill>
-                    <a:blip r:embed="rId18"/>
-                    <a:stretch>
-                      <a:fillRect/>
-                    </a:stretch>
-                  </pic:blipFill>
-                  <pic:spPr>
-                    <a:xfrm>
-                      <a:off x="0" y="0"/>
-                      <a:ext cx="5486400" cy="4557761"/>
-                    </a:xfrm>
-                    <a:prstGeom prst="rect"/>
-                  </pic:spPr>
-                </pic:pic>
-              </a:graphicData>
-            </a:graphic>
-          </wp:inline>
-        </w:drawing>
-      </w:r>
-    </w:p>
-    <w:tbl>
-      <w:tblPr>
-        <w:tblW w:type="auto" w:w="0"/>
-        <w:jc w:val="center"/>
-        <w:tblLook w:firstColumn="1" w:firstRow="1" w:lastColumn="0" w:lastRow="0" w:noHBand="0" w:noVBand="1" w:val="04A0"/>
-      </w:tblPr>
-      <w:tblGrid>
-        <w:gridCol w:w="2880"/>
-        <w:gridCol w:w="2880"/>
-        <w:gridCol w:w="2880"/>
-      </w:tblGrid>
-      <w:tr>
-        <w:tc>
-          <w:tcPr>
-            <w:tcW w:type="dxa" w:w="3402"/>
-            <w:shd w:fill="1E40AF"/>
-          </w:tcPr>
-          <w:p>
-            <w:pPr>
-              <w:jc w:val="center"/>
-            </w:pPr>
-            <w:r>
-              <w:rPr>
-                <w:rFonts w:ascii="Arial" w:hAnsi="Arial"/>
-                <w:b/>
-                <w:color w:val="FFFFFF"/>
-                <w:sz w:val="18"/>
-              </w:rPr>
-              <w:t>Comparison</w:t>
-            </w:r>
-          </w:p>
-        </w:tc>
-        <w:tc>
-          <w:tcPr>
-            <w:tcW w:type="dxa" w:w="2268"/>
-            <w:shd w:fill="1E40AF"/>
-          </w:tcPr>
-          <w:p>
-            <w:pPr>
-              <w:jc w:val="center"/>
-            </w:pPr>
-            <w:r>
-              <w:rPr>
-                <w:rFonts w:ascii="Arial" w:hAnsi="Arial"/>
-                <w:b/>
-                <w:color w:val="FFFFFF"/>
-                <w:sz w:val="18"/>
-              </w:rPr>
-              <w:t>GPT-5.2</w:t>
-            </w:r>
-          </w:p>
-        </w:tc>
-        <w:tc>
-          <w:tcPr>
-            <w:tcW w:type="dxa" w:w="2268"/>
-            <w:shd w:fill="1E40AF"/>
-          </w:tcPr>
-          <w:p>
-            <w:pPr>
-              <w:jc w:val="center"/>
-            </w:pPr>
-            <w:r>
-              <w:rPr>
-                <w:rFonts w:ascii="Arial" w:hAnsi="Arial"/>
-                <w:b/>
-                <w:color w:val="FFFFFF"/>
-                <w:sz w:val="18"/>
-              </w:rPr>
-              <w:t>MedGemma 27B</w:t>
-            </w:r>
-          </w:p>
-        </w:tc>
-      </w:tr>
-      <w:tr>
-        <w:tc>
-          <w:tcPr>
-            <w:tcW w:type="dxa" w:w="3402"/>
-          </w:tcPr>
-          <w:p>
-            <w:pPr>
-              <w:jc w:val="center"/>
-            </w:pPr>
-            <w:r>
-              <w:rPr>
-                <w:rFonts w:ascii="Arial" w:hAnsi="Arial"/>
-                <w:sz w:val="18"/>
-              </w:rPr>
-              <w:t>Overall Score vs Quality (ρ)</w:t>
-            </w:r>
-          </w:p>
-        </w:tc>
-        <w:tc>
-          <w:tcPr>
-            <w:tcW w:type="dxa" w:w="2268"/>
-          </w:tcPr>
-          <w:p>
-            <w:pPr>
-              <w:jc w:val="center"/>
-            </w:pPr>
-            <w:r>
-              <w:rPr>
-                <w:rFonts w:ascii="Arial" w:hAnsi="Arial"/>
-                <w:sz w:val="18"/>
-              </w:rPr>
-              <w:t>0.722</w:t>
-            </w:r>
-          </w:p>
-        </w:tc>
-        <w:tc>
-          <w:tcPr>
-            <w:tcW w:type="dxa" w:w="2268"/>
-          </w:tcPr>
-          <w:p>
-            <w:pPr>
-              <w:jc w:val="center"/>
-            </w:pPr>
-            <w:r>
-              <w:rPr>
-                <w:rFonts w:ascii="Arial" w:hAnsi="Arial"/>
-                <w:sz w:val="18"/>
-              </w:rPr>
-              <w:t>0.661</w:t>
-            </w:r>
-          </w:p>
-        </w:tc>
-      </w:tr>
-      <w:tr>
-        <w:tc>
-          <w:tcPr>
-            <w:tcW w:type="dxa" w:w="3402"/>
-            <w:shd w:fill="F0F4FF"/>
-          </w:tcPr>
-          <w:p>
-            <w:pPr>
-              <w:jc w:val="center"/>
-            </w:pPr>
-            <w:r>
-              <w:rPr>
-                <w:rFonts w:ascii="Arial" w:hAnsi="Arial"/>
-                <w:sz w:val="18"/>
-              </w:rPr>
-              <w:t xml:space="preserve">  p-value</w:t>
-            </w:r>
-          </w:p>
-        </w:tc>
-        <w:tc>
-          <w:tcPr>
-            <w:tcW w:type="dxa" w:w="2268"/>
-            <w:shd w:fill="F0F4FF"/>
-          </w:tcPr>
-          <w:p>
-            <w:pPr>
-              <w:jc w:val="center"/>
-            </w:pPr>
-            <w:r>
-              <w:rPr>
-                <w:rFonts w:ascii="Arial" w:hAnsi="Arial"/>
-                <w:sz w:val="18"/>
-              </w:rPr>
-              <w:t>0.0000</w:t>
-            </w:r>
-          </w:p>
-        </w:tc>
-        <w:tc>
-          <w:tcPr>
-            <w:tcW w:type="dxa" w:w="2268"/>
-            <w:shd w:fill="F0F4FF"/>
-          </w:tcPr>
-          <w:p>
-            <w:pPr>
-              <w:jc w:val="center"/>
-            </w:pPr>
-            <w:r>
-              <w:rPr>
-                <w:rFonts w:ascii="Arial" w:hAnsi="Arial"/>
-                <w:sz w:val="18"/>
-              </w:rPr>
-              <w:t>0.0000</w:t>
-            </w:r>
-          </w:p>
-        </w:tc>
-      </w:tr>
-      <w:tr>
-        <w:tc>
-          <w:tcPr>
-            <w:tcW w:type="dxa" w:w="3402"/>
-          </w:tcPr>
-          <w:p>
-            <w:pPr>
-              <w:jc w:val="center"/>
-            </w:pPr>
-            <w:r>
-              <w:rPr>
-                <w:rFonts w:ascii="Arial" w:hAnsi="Arial"/>
-                <w:sz w:val="18"/>
-              </w:rPr>
-              <w:t>Overall Score vs Exact Match (ρ)</w:t>
-            </w:r>
-          </w:p>
-        </w:tc>
-        <w:tc>
-          <w:tcPr>
-            <w:tcW w:type="dxa" w:w="2268"/>
-          </w:tcPr>
-          <w:p>
-            <w:pPr>
-              <w:jc w:val="center"/>
-            </w:pPr>
-            <w:r>
-              <w:rPr>
-                <w:rFonts w:ascii="Arial" w:hAnsi="Arial"/>
-                <w:sz w:val="18"/>
-              </w:rPr>
-              <w:t>0.766</w:t>
-            </w:r>
-          </w:p>
-        </w:tc>
-        <w:tc>
-          <w:tcPr>
-            <w:tcW w:type="dxa" w:w="2268"/>
-          </w:tcPr>
-          <w:p>
-            <w:pPr>
-              <w:jc w:val="center"/>
-            </w:pPr>
-            <w:r>
-              <w:rPr>
-                <w:rFonts w:ascii="Arial" w:hAnsi="Arial"/>
-                <w:sz w:val="18"/>
-              </w:rPr>
-              <w:t>0.694</w:t>
-            </w:r>
-          </w:p>
-        </w:tc>
-      </w:tr>
-      <w:tr>
-        <w:tc>
-          <w:tcPr>
-            <w:tcW w:type="dxa" w:w="3402"/>
-            <w:shd w:fill="F0F4FF"/>
-          </w:tcPr>
-          <w:p>
-            <w:pPr>
-              <w:jc w:val="center"/>
-            </w:pPr>
-            <w:r>
-              <w:rPr>
-                <w:rFonts w:ascii="Arial" w:hAnsi="Arial"/>
-                <w:sz w:val="18"/>
-              </w:rPr>
-              <w:t xml:space="preserve">  p-value</w:t>
-            </w:r>
-          </w:p>
-        </w:tc>
-        <w:tc>
-          <w:tcPr>
-            <w:tcW w:type="dxa" w:w="2268"/>
-            <w:shd w:fill="F0F4FF"/>
-          </w:tcPr>
-          <w:p>
-            <w:pPr>
-              <w:jc w:val="center"/>
-            </w:pPr>
-            <w:r>
-              <w:rPr>
-                <w:rFonts w:ascii="Arial" w:hAnsi="Arial"/>
-                <w:sz w:val="18"/>
-              </w:rPr>
-              <w:t>0.0000</w:t>
-            </w:r>
-          </w:p>
-        </w:tc>
-        <w:tc>
-          <w:tcPr>
-            <w:tcW w:type="dxa" w:w="2268"/>
-            <w:shd w:fill="F0F4FF"/>
-          </w:tcPr>
-          <w:p>
-            <w:pPr>
-              <w:jc w:val="center"/>
-            </w:pPr>
-            <w:r>
-              <w:rPr>
-                <w:rFonts w:ascii="Arial" w:hAnsi="Arial"/>
-                <w:sz w:val="18"/>
-              </w:rPr>
-              <w:t>0.0000</w:t>
-            </w:r>
-          </w:p>
-        </w:tc>
-      </w:tr>
-      <w:tr>
-        <w:tc>
-          <w:tcPr>
-            <w:tcW w:type="dxa" w:w="3402"/>
-          </w:tcPr>
-          <w:p>
-            <w:pPr>
-              <w:jc w:val="center"/>
-            </w:pPr>
-            <w:r>
-              <w:rPr>
-                <w:rFonts w:ascii="Arial" w:hAnsi="Arial"/>
-                <w:sz w:val="18"/>
-              </w:rPr>
-              <w:t>N pairs</w:t>
-            </w:r>
-          </w:p>
-        </w:tc>
-        <w:tc>
-          <w:tcPr>
-            <w:tcW w:type="dxa" w:w="2268"/>
-          </w:tcPr>
-          <w:p>
-            <w:pPr>
-              <w:jc w:val="center"/>
-            </w:pPr>
-            <w:r>
-              <w:rPr>
-                <w:rFonts w:ascii="Arial" w:hAnsi="Arial"/>
-                <w:sz w:val="18"/>
-              </w:rPr>
-              <w:t>414</w:t>
-            </w:r>
-          </w:p>
-        </w:tc>
-        <w:tc>
-          <w:tcPr>
-            <w:tcW w:type="dxa" w:w="2268"/>
-          </w:tcPr>
-          <w:p>
-            <w:pPr>
-              <w:jc w:val="center"/>
-            </w:pPr>
-            <w:r>
-              <w:rPr>
-                <w:rFonts w:ascii="Arial" w:hAnsi="Arial"/>
-                <w:sz w:val="18"/>
-              </w:rPr>
-              <w:t>414</w:t>
-            </w:r>
-          </w:p>
-        </w:tc>
-      </w:tr>
-    </w:tbl>
-    <w:p>
-      <w:r>
-        <w:br w:type="page"/>
-      </w:r>
-    </w:p>
-    <w:p>
-      <w:pPr>
-        <w:pStyle w:val="Heading1"/>
-      </w:pPr>
-      <w:r>
-        <w:t>15. Doctor's Direct Rating of AI Judges</w:t>
+        <w:t>13. Uro-Oncologist's Direct Rating of AI Judges</w:t>
       </w:r>
     </w:p>
     <w:p>
@@ -12749,7 +10773,7 @@
         <w:drawing>
           <wp:inline xmlns:a="http://schemas.openxmlformats.org/drawingml/2006/main" xmlns:pic="http://schemas.openxmlformats.org/drawingml/2006/picture">
             <wp:extent cx="5486400" cy="2407487"/>
-            <wp:docPr id="11" name="Picture 11"/>
+            <wp:docPr id="9" name="Picture 9"/>
             <wp:cNvGraphicFramePr>
               <a:graphicFrameLocks noChangeAspect="1"/>
             </wp:cNvGraphicFramePr>
@@ -12761,7 +10785,7 @@
                     <pic:cNvPicPr/>
                   </pic:nvPicPr>
                   <pic:blipFill>
-                    <a:blip r:embed="rId19"/>
+                    <a:blip r:embed="rId17"/>
                     <a:stretch>
                       <a:fillRect/>
                     </a:stretch>
@@ -12939,7 +10963,7 @@
                 <w:rFonts w:ascii="Arial" w:hAnsi="Arial"/>
                 <w:sz w:val="18"/>
               </w:rPr>
-              <w:t>352 (85%)</w:t>
+              <w:t>352 (85.0%)</w:t>
             </w:r>
           </w:p>
         </w:tc>
@@ -12957,7 +10981,7 @@
                 <w:rFonts w:ascii="Arial" w:hAnsi="Arial"/>
                 <w:sz w:val="18"/>
               </w:rPr>
-              <w:t>353 (85%)</w:t>
+              <w:t>353 (85.3%)</w:t>
             </w:r>
           </w:p>
         </w:tc>
@@ -12993,7 +11017,7 @@
                 <w:rFonts w:ascii="Arial" w:hAnsi="Arial"/>
                 <w:sz w:val="18"/>
               </w:rPr>
-              <w:t>4 (1%)</w:t>
+              <w:t>4 (1.0%)</w:t>
             </w:r>
           </w:p>
         </w:tc>
@@ -13010,7 +11034,7 @@
                 <w:rFonts w:ascii="Arial" w:hAnsi="Arial"/>
                 <w:sz w:val="18"/>
               </w:rPr>
-              <w:t>24 (6%)</w:t>
+              <w:t>24 (5.8%)</w:t>
             </w:r>
           </w:p>
         </w:tc>
@@ -13048,7 +11072,7 @@
                 <w:rFonts w:ascii="Arial" w:hAnsi="Arial"/>
                 <w:sz w:val="18"/>
               </w:rPr>
-              <w:t>58 (14%)</w:t>
+              <w:t>58 (14.0%)</w:t>
             </w:r>
           </w:p>
         </w:tc>
@@ -13066,7 +11090,7 @@
                 <w:rFonts w:ascii="Arial" w:hAnsi="Arial"/>
                 <w:sz w:val="18"/>
               </w:rPr>
-              <w:t>37 (9%)</w:t>
+              <w:t>37 (8.9%)</w:t>
             </w:r>
           </w:p>
         </w:tc>
@@ -13135,12 +11159,12 @@
         <w:pStyle w:val="Heading1"/>
       </w:pPr>
       <w:r>
-        <w:t>16. Per-Model Judge Accuracy</w:t>
+        <w:t>14. Per-Model Judge Accuracy</w:t>
       </w:r>
     </w:p>
     <w:p>
       <w:r>
-        <w:t>This heatmap shows the agreement rate (%) between each judge and the doctor, broken down by model.</w:t>
+        <w:t>This heatmap shows the agreement rate (%) between each judge and the uro-oncologist, broken down by model.</w:t>
       </w:r>
     </w:p>
     <w:p>
@@ -13151,7 +11175,7 @@
         <w:drawing>
           <wp:inline xmlns:a="http://schemas.openxmlformats.org/drawingml/2006/main" xmlns:pic="http://schemas.openxmlformats.org/drawingml/2006/picture">
             <wp:extent cx="5486400" cy="4476558"/>
-            <wp:docPr id="12" name="Picture 12"/>
+            <wp:docPr id="10" name="Picture 10"/>
             <wp:cNvGraphicFramePr>
               <a:graphicFrameLocks noChangeAspect="1"/>
             </wp:cNvGraphicFramePr>
@@ -13163,7 +11187,7 @@
                     <pic:cNvPicPr/>
                   </pic:nvPicPr>
                   <pic:blipFill>
-                    <a:blip r:embed="rId20"/>
+                    <a:blip r:embed="rId18"/>
                     <a:stretch>
                       <a:fillRect/>
                     </a:stretch>
@@ -13231,7 +11255,7 @@
                 <w:color w:val="FFFFFF"/>
                 <w:sz w:val="18"/>
               </w:rPr>
-              <w:t>Doctor Acceptable %</w:t>
+              <w:t>Uro-Oncologist Acceptable %</w:t>
             </w:r>
           </w:p>
         </w:tc>
@@ -13307,7 +11331,7 @@
                 <w:rFonts w:ascii="Arial" w:hAnsi="Arial"/>
                 <w:sz w:val="18"/>
               </w:rPr>
-              <w:t>49%</w:t>
+              <w:t>49.3%</w:t>
             </w:r>
           </w:p>
         </w:tc>
@@ -13324,7 +11348,7 @@
                 <w:rFonts w:ascii="Arial" w:hAnsi="Arial"/>
                 <w:sz w:val="18"/>
               </w:rPr>
-              <w:t>90%</w:t>
+              <w:t>89.9%</w:t>
             </w:r>
           </w:p>
         </w:tc>
@@ -13341,7 +11365,7 @@
                 <w:rFonts w:ascii="Arial" w:hAnsi="Arial"/>
                 <w:sz w:val="18"/>
               </w:rPr>
-              <w:t>93%</w:t>
+              <w:t>92.8%</w:t>
             </w:r>
           </w:p>
         </w:tc>
@@ -13379,7 +11403,7 @@
                 <w:rFonts w:ascii="Arial" w:hAnsi="Arial"/>
                 <w:sz w:val="18"/>
               </w:rPr>
-              <w:t>64%</w:t>
+              <w:t>63.8%</w:t>
             </w:r>
           </w:p>
         </w:tc>
@@ -13397,7 +11421,7 @@
                 <w:rFonts w:ascii="Arial" w:hAnsi="Arial"/>
                 <w:sz w:val="18"/>
               </w:rPr>
-              <w:t>78%</w:t>
+              <w:t>78.3%</w:t>
             </w:r>
           </w:p>
         </w:tc>
@@ -13415,7 +11439,7 @@
                 <w:rFonts w:ascii="Arial" w:hAnsi="Arial"/>
                 <w:sz w:val="18"/>
               </w:rPr>
-              <w:t>78%</w:t>
+              <w:t>78.3%</w:t>
             </w:r>
           </w:p>
         </w:tc>
@@ -13451,7 +11475,7 @@
                 <w:rFonts w:ascii="Arial" w:hAnsi="Arial"/>
                 <w:sz w:val="18"/>
               </w:rPr>
-              <w:t>69%</w:t>
+              <w:t>69.1%</w:t>
             </w:r>
           </w:p>
         </w:tc>
@@ -13468,7 +11492,7 @@
                 <w:rFonts w:ascii="Arial" w:hAnsi="Arial"/>
                 <w:sz w:val="18"/>
               </w:rPr>
-              <w:t>84%</w:t>
+              <w:t>83.8%</w:t>
             </w:r>
           </w:p>
         </w:tc>
@@ -13485,7 +11509,7 @@
                 <w:rFonts w:ascii="Arial" w:hAnsi="Arial"/>
                 <w:sz w:val="18"/>
               </w:rPr>
-              <w:t>87%</w:t>
+              <w:t>86.8%</w:t>
             </w:r>
           </w:p>
         </w:tc>
@@ -13523,7 +11547,7 @@
                 <w:rFonts w:ascii="Arial" w:hAnsi="Arial"/>
                 <w:sz w:val="18"/>
               </w:rPr>
-              <w:t>75%</w:t>
+              <w:t>74.6%</w:t>
             </w:r>
           </w:p>
         </w:tc>
@@ -13541,7 +11565,7 @@
                 <w:rFonts w:ascii="Arial" w:hAnsi="Arial"/>
                 <w:sz w:val="18"/>
               </w:rPr>
-              <w:t>72%</w:t>
+              <w:t>71.6%</w:t>
             </w:r>
           </w:p>
         </w:tc>
@@ -13559,7 +11583,7 @@
                 <w:rFonts w:ascii="Arial" w:hAnsi="Arial"/>
                 <w:sz w:val="18"/>
               </w:rPr>
-              <w:t>76%</w:t>
+              <w:t>76.1%</w:t>
             </w:r>
           </w:p>
         </w:tc>
@@ -13595,7 +11619,7 @@
                 <w:rFonts w:ascii="Arial" w:hAnsi="Arial"/>
                 <w:sz w:val="18"/>
               </w:rPr>
-              <w:t>48%</w:t>
+              <w:t>47.8%</w:t>
             </w:r>
           </w:p>
         </w:tc>
@@ -13612,7 +11636,7 @@
                 <w:rFonts w:ascii="Arial" w:hAnsi="Arial"/>
                 <w:sz w:val="18"/>
               </w:rPr>
-              <w:t>87%</w:t>
+              <w:t>87.0%</w:t>
             </w:r>
           </w:p>
         </w:tc>
@@ -13629,7 +11653,7 @@
                 <w:rFonts w:ascii="Arial" w:hAnsi="Arial"/>
                 <w:sz w:val="18"/>
               </w:rPr>
-              <w:t>87%</w:t>
+              <w:t>87.0%</w:t>
             </w:r>
           </w:p>
         </w:tc>
@@ -13667,7 +11691,7 @@
                 <w:rFonts w:ascii="Arial" w:hAnsi="Arial"/>
                 <w:sz w:val="18"/>
               </w:rPr>
-              <w:t>75%</w:t>
+              <w:t>75.4%</w:t>
             </w:r>
           </w:p>
         </w:tc>
@@ -13685,7 +11709,7 @@
                 <w:rFonts w:ascii="Arial" w:hAnsi="Arial"/>
                 <w:sz w:val="18"/>
               </w:rPr>
-              <w:t>80%</w:t>
+              <w:t>80.0%</w:t>
             </w:r>
           </w:p>
         </w:tc>
@@ -13703,7 +11727,7 @@
                 <w:rFonts w:ascii="Arial" w:hAnsi="Arial"/>
                 <w:sz w:val="18"/>
               </w:rPr>
-              <w:t>86%</w:t>
+              <w:t>86.2%</w:t>
             </w:r>
           </w:p>
         </w:tc>
@@ -13719,7 +11743,7 @@
         <w:pStyle w:val="Heading1"/>
       </w:pPr>
       <w:r>
-        <w:t>17. Inter-Judge Agreement</w:t>
+        <w:t>15. Inter-Judge Agreement</w:t>
       </w:r>
     </w:p>
     <w:p>
@@ -13735,7 +11759,7 @@
         <w:drawing>
           <wp:inline xmlns:a="http://schemas.openxmlformats.org/drawingml/2006/main" xmlns:pic="http://schemas.openxmlformats.org/drawingml/2006/picture">
             <wp:extent cx="5486400" cy="4814253"/>
-            <wp:docPr id="13" name="Picture 13"/>
+            <wp:docPr id="11" name="Picture 11"/>
             <wp:cNvGraphicFramePr>
               <a:graphicFrameLocks noChangeAspect="1"/>
             </wp:cNvGraphicFramePr>
@@ -13747,7 +11771,7 @@
                     <pic:cNvPicPr/>
                   </pic:nvPicPr>
                   <pic:blipFill>
-                    <a:blip r:embed="rId21"/>
+                    <a:blip r:embed="rId19"/>
                     <a:stretch>
                       <a:fillRect/>
                     </a:stretch>
@@ -13781,7 +11805,7 @@
         <w:pStyle w:val="Heading1"/>
       </w:pPr>
       <w:r>
-        <w:t>18. MedGemma Self-Judging Bias</w:t>
+        <w:t>16. MedGemma Self-Judging Bias</w:t>
       </w:r>
     </w:p>
     <w:p>
@@ -13797,7 +11821,7 @@
         <w:drawing>
           <wp:inline xmlns:a="http://schemas.openxmlformats.org/drawingml/2006/main" xmlns:pic="http://schemas.openxmlformats.org/drawingml/2006/picture">
             <wp:extent cx="5486400" cy="3026819"/>
-            <wp:docPr id="14" name="Picture 14"/>
+            <wp:docPr id="12" name="Picture 12"/>
             <wp:cNvGraphicFramePr>
               <a:graphicFrameLocks noChangeAspect="1"/>
             </wp:cNvGraphicFramePr>
@@ -13809,7 +11833,7 @@
                     <pic:cNvPicPr/>
                   </pic:nvPicPr>
                   <pic:blipFill>
-                    <a:blip r:embed="rId22"/>
+                    <a:blip r:embed="rId20"/>
                     <a:stretch>
                       <a:fillRect/>
                     </a:stretch>
@@ -14079,12 +12103,12 @@
         <w:pStyle w:val="Heading1"/>
       </w:pPr>
       <w:r>
-        <w:t>19. Clinical Safety Analysis</w:t>
+        <w:t>17. Clinical Safety Analysis</w:t>
       </w:r>
     </w:p>
     <w:p>
       <w:r>
-        <w:t>Clinical safety is assessed by examining two types of judge errors when compared to the doctor's assessment:</w:t>
+        <w:t>Clinical safety is assessed by examining two types of judge errors when compared to the uro-oncologist's assessment:</w:t>
       </w:r>
     </w:p>
     <w:p>
@@ -14096,7 +12120,7 @@
           <w:rFonts w:ascii="Arial" w:hAnsi="Arial"/>
           <w:sz w:val="20"/>
         </w:rPr>
-        <w:t>False Positive (dangerous): Judge approves a prediction the doctor rejects. Could lead to inappropriate treatment.</w:t>
+        <w:t>False Positive (dangerous): Judge approves a prediction the uro-oncologist rejects. Could lead to inappropriate treatment.</w:t>
       </w:r>
     </w:p>
     <w:p>
@@ -14108,7 +12132,7 @@
           <w:rFonts w:ascii="Arial" w:hAnsi="Arial"/>
           <w:sz w:val="20"/>
         </w:rPr>
-        <w:t>False Negative (overly strict): Judge rejects a prediction the doctor approves. Could prevent appropriate treatment.</w:t>
+        <w:t>False Negative (overly strict): Judge rejects a prediction the uro-oncologist approves. Could prevent appropriate treatment.</w:t>
       </w:r>
     </w:p>
     <w:tbl>
@@ -14477,7 +12501,7 @@
         <w:pStyle w:val="Heading1"/>
       </w:pPr>
       <w:r>
-        <w:t>20. Summary Comparison: GPT-5.2 vs MedGemma 27B</w:t>
+        <w:t>18. Summary Comparison: GPT-5.2 vs MedGemma 27B</w:t>
       </w:r>
     </w:p>
     <w:p>
@@ -14572,7 +12596,7 @@
                 <w:rFonts w:ascii="Arial" w:hAnsi="Arial"/>
                 <w:sz w:val="18"/>
               </w:rPr>
-              <w:t>Cohen's κ (vs Doctor)</w:t>
+              <w:t>Cohen's κ (vs Uro-Oncologist)</w:t>
             </w:r>
           </w:p>
         </w:tc>
@@ -14953,7 +12977,7 @@
                 <w:rFonts w:ascii="Arial" w:hAnsi="Arial"/>
                 <w:sz w:val="18"/>
               </w:rPr>
-              <w:t>Doctor Agree %</w:t>
+              <w:t>Uro-Oncologist Agree %</w:t>
             </w:r>
           </w:p>
         </w:tc>
@@ -14971,7 +12995,7 @@
                 <w:rFonts w:ascii="Arial" w:hAnsi="Arial"/>
                 <w:sz w:val="18"/>
               </w:rPr>
-              <w:t>85%</w:t>
+              <w:t>85.0%</w:t>
             </w:r>
           </w:p>
         </w:tc>
@@ -14989,7 +13013,7 @@
                 <w:rFonts w:ascii="Arial" w:hAnsi="Arial"/>
                 <w:sz w:val="18"/>
               </w:rPr>
-              <w:t>85%</w:t>
+              <w:t>85.3%</w:t>
             </w:r>
           </w:p>
         </w:tc>
@@ -15385,7 +13409,7 @@
         <w:pStyle w:val="Heading1"/>
       </w:pPr>
       <w:r>
-        <w:t>21. German–English Medical Glossary</w:t>
+        <w:t>19. German–English Medical Glossary</w:t>
       </w:r>
     </w:p>
     <w:p>
@@ -16240,7 +14264,7 @@
         <w:pStyle w:val="Heading1"/>
       </w:pPr>
       <w:r>
-        <w:t>22. Conclusions &amp; Recommendations</w:t>
+        <w:t>20. Conclusions &amp; Recommendations</w:t>
       </w:r>
     </w:p>
     <w:p>
@@ -16260,7 +14284,7 @@
           <w:rFonts w:ascii="Arial" w:hAnsi="Arial"/>
           <w:sz w:val="20"/>
         </w:rPr>
-        <w:t>Model Performance: MedGemma 27B achieved the highest doctor-rated quality (6.1/9) with 75% therapy acceptability. MedGemma 27B scored highest on automated judge evaluation (0.76/1.0).</w:t>
+        <w:t>Model Performance: MedGemma 27B achieved the highest uro-oncologist-rated quality (6.1/9) with 75.4% therapy acceptability. MedGemma 27B scored highest on automated judge evaluation (0.76/1.0).</w:t>
       </w:r>
     </w:p>
     <w:p>
@@ -16272,7 +14296,7 @@
           <w:rFonts w:ascii="Arial" w:hAnsi="Arial"/>
           <w:sz w:val="20"/>
         </w:rPr>
-        <w:t>Best AI Judge: MedGemma 27B showed the strongest agreement with the doctor (κ = 0.675). Both judges show moderate agreement, indicating they are useful but not perfect proxies for expert clinical judgment.</w:t>
+        <w:t>Best AI Judge: MedGemma 27B showed the strongest agreement with the uro-oncologist (κ = 0.675). Both judges show moderate agreement, indicating they are useful but not perfect proxies for expert clinical judgment.</w:t>
       </w:r>
     </w:p>
     <w:p>
@@ -16328,7 +14352,7 @@
           <w:rFonts w:ascii="Arial" w:hAnsi="Arial"/>
           <w:sz w:val="20"/>
         </w:rPr>
-        <w:t>AI judges should be used as screening tools, not final arbiters. Doctor review remains essential for clinical safety.</w:t>
+        <w:t>AI judges should be used as screening tools, not final arbiters. Uro-oncologist review remains essential for clinical safety.</w:t>
       </w:r>
     </w:p>
     <w:p>
@@ -16364,7 +14388,7 @@
           <w:rFonts w:ascii="Arial" w:hAnsi="Arial"/>
           <w:sz w:val="20"/>
         </w:rPr>
-        <w:t>The strong Spearman correlations (ρ &gt; 0.64) between judge scores and doctor ratings suggest automated judge scores are useful proxies for prediction quality, enabling scalable evaluation.</w:t>
+        <w:t>The strong Spearman correlations (ρ &gt; 0.64) between judge scores and uro-oncologist ratings suggest automated judge scores are useful proxies for prediction quality, enabling scalable evaluation.</w:t>
       </w:r>
     </w:p>
     <w:p>
@@ -16389,7 +14413,7 @@
     </w:p>
     <w:p>
       <w:r>
-        <w:t>This study relies on a single physician reviewer, which may introduce individual assessment bias. The case dataset is limited to RCC from a single institution's tumor boards. The doctor reviewed all 69 cases for both model evaluation and judge evaluation, providing complete coverage. Ground truth represents the tumor board consensus, which is one valid approach but not necessarily the only correct therapy. All cases use German medical terminology, which may affect model performance compared to English-language clinical data.</w:t>
+        <w:t>This study relies on a single physician reviewer, which may introduce individual assessment bias. The case dataset is limited to RCC from a single institution's tumor boards. The uro-oncologist reviewed all 69 cases for both model evaluation and judge evaluation, providing complete coverage. Ground truth represents the tumor board consensus, which is one valid approach but not necessarily the only correct therapy. All cases use German medical terminology, which may affect model performance compared to English-language clinical data.</w:t>
       </w:r>
     </w:p>
     <w:p>

</xml_diff>